<commit_message>
Theme 1.3 Slide 15
</commit_message>
<xml_diff>
--- a/Тема1.Введение в экономику организации.docx
+++ b/Тема1.Введение в экономику организации.docx
@@ -2392,14 +2392,7 @@
           <w:rFonts w:ascii="Times New Roman" w:hAnsi="Times New Roman" w:cs="Times New Roman"/>
           <w:sz w:val="22"/>
         </w:rPr>
-        <w:t>Производстве</w:t>
-      </w:r>
-      <w:r>
-        <w:rPr>
-          <w:rFonts w:ascii="Times New Roman" w:hAnsi="Times New Roman" w:cs="Times New Roman"/>
-          <w:sz w:val="22"/>
-        </w:rPr>
-        <w:t>нные кооперативы</w:t>
+        <w:t>Производственные кооперативы</w:t>
       </w:r>
     </w:p>
     <w:p>
@@ -2535,14 +2528,7 @@
           <w:rFonts w:ascii="Times New Roman" w:hAnsi="Times New Roman" w:cs="Times New Roman"/>
           <w:sz w:val="22"/>
         </w:rPr>
-        <w:t xml:space="preserve">Ассоциации </w:t>
-      </w:r>
-      <w:r>
-        <w:rPr>
-          <w:rFonts w:ascii="Times New Roman" w:hAnsi="Times New Roman" w:cs="Times New Roman"/>
-          <w:sz w:val="22"/>
-        </w:rPr>
-        <w:t>и союзы</w:t>
+        <w:t>Ассоциации и союзы</w:t>
       </w:r>
     </w:p>
     <w:p>
@@ -2590,14 +2576,7 @@
           <w:rFonts w:ascii="Times New Roman" w:hAnsi="Times New Roman" w:cs="Times New Roman"/>
           <w:sz w:val="22"/>
         </w:rPr>
-        <w:t xml:space="preserve">Казачьи общества, </w:t>
-      </w:r>
-      <w:r>
-        <w:rPr>
-          <w:rFonts w:ascii="Times New Roman" w:hAnsi="Times New Roman" w:cs="Times New Roman"/>
-          <w:sz w:val="22"/>
-        </w:rPr>
-        <w:t>внесенные в государственный реестр казачьих обществ в Российской Федерации</w:t>
+        <w:t>Казачьи общества, внесенные в государственный реестр казачьих обществ в Российской Федерации</w:t>
       </w:r>
     </w:p>
     <w:p>
@@ -2713,14 +2692,7 @@
           <w:rFonts w:ascii="Times New Roman" w:hAnsi="Times New Roman" w:cs="Times New Roman"/>
           <w:sz w:val="22"/>
         </w:rPr>
-        <w:t>Автономные не</w:t>
-      </w:r>
-      <w:r>
-        <w:rPr>
-          <w:rFonts w:ascii="Times New Roman" w:hAnsi="Times New Roman" w:cs="Times New Roman"/>
-          <w:sz w:val="22"/>
-        </w:rPr>
-        <w:t>коммерческие организации</w:t>
+        <w:t>Автономные некоммерческие организации</w:t>
       </w:r>
     </w:p>
     <w:p>
@@ -2763,14 +2735,7 @@
           <w:rFonts w:ascii="Times New Roman" w:hAnsi="Times New Roman" w:cs="Times New Roman"/>
           <w:sz w:val="22"/>
         </w:rPr>
-        <w:t>Помимо организационно-правовых фо</w:t>
-      </w:r>
-      <w:r>
-        <w:rPr>
-          <w:rFonts w:ascii="Times New Roman" w:hAnsi="Times New Roman" w:cs="Times New Roman"/>
-          <w:sz w:val="22"/>
-        </w:rPr>
-        <w:t>рм существуют</w:t>
+        <w:t>Помимо организационно-правовых форм существуют</w:t>
       </w:r>
     </w:p>
     <w:p>
@@ -2951,8 +2916,2604 @@
           <w:sz w:val="22"/>
         </w:rPr>
       </w:pPr>
+    </w:p>
+    <w:p>
+      <w:pPr>
+        <w:tabs>
+          <w:tab w:val="left" w:pos="2160"/>
+          <w:tab w:val="left" w:pos="3825"/>
+        </w:tabs>
+        <w:ind w:left="360"/>
+        <w:rPr>
+          <w:rFonts w:ascii="Times New Roman" w:hAnsi="Times New Roman" w:cs="Times New Roman"/>
+          <w:sz w:val="22"/>
+        </w:rPr>
+      </w:pPr>
+    </w:p>
+    <w:p>
+      <w:pPr>
+        <w:tabs>
+          <w:tab w:val="left" w:pos="2160"/>
+          <w:tab w:val="left" w:pos="3825"/>
+        </w:tabs>
+        <w:ind w:left="360"/>
+        <w:rPr>
+          <w:rFonts w:ascii="Times New Roman" w:hAnsi="Times New Roman" w:cs="Times New Roman"/>
+          <w:sz w:val="22"/>
+        </w:rPr>
+      </w:pPr>
+    </w:p>
+    <w:p>
+      <w:pPr>
+        <w:tabs>
+          <w:tab w:val="left" w:pos="2160"/>
+          <w:tab w:val="left" w:pos="3825"/>
+        </w:tabs>
+        <w:ind w:left="360"/>
+        <w:rPr>
+          <w:rFonts w:ascii="Times New Roman" w:hAnsi="Times New Roman" w:cs="Times New Roman"/>
+          <w:sz w:val="22"/>
+        </w:rPr>
+      </w:pPr>
+    </w:p>
+    <w:p>
+      <w:pPr>
+        <w:tabs>
+          <w:tab w:val="left" w:pos="2160"/>
+          <w:tab w:val="left" w:pos="3825"/>
+        </w:tabs>
+        <w:ind w:left="360"/>
+        <w:rPr>
+          <w:rFonts w:ascii="Times New Roman" w:hAnsi="Times New Roman" w:cs="Times New Roman"/>
+          <w:sz w:val="22"/>
+        </w:rPr>
+      </w:pPr>
+    </w:p>
+    <w:p>
+      <w:pPr>
+        <w:tabs>
+          <w:tab w:val="left" w:pos="2160"/>
+          <w:tab w:val="left" w:pos="3825"/>
+        </w:tabs>
+        <w:ind w:left="360"/>
+        <w:rPr>
+          <w:rFonts w:ascii="Times New Roman" w:hAnsi="Times New Roman" w:cs="Times New Roman"/>
+          <w:sz w:val="22"/>
+        </w:rPr>
+      </w:pPr>
+    </w:p>
+    <w:p>
+      <w:pPr>
+        <w:tabs>
+          <w:tab w:val="left" w:pos="2160"/>
+          <w:tab w:val="left" w:pos="3825"/>
+        </w:tabs>
+        <w:ind w:left="360"/>
+        <w:rPr>
+          <w:rFonts w:ascii="Times New Roman" w:hAnsi="Times New Roman" w:cs="Times New Roman"/>
+          <w:sz w:val="22"/>
+        </w:rPr>
+      </w:pPr>
+    </w:p>
+    <w:p>
+      <w:pPr>
+        <w:tabs>
+          <w:tab w:val="left" w:pos="2160"/>
+          <w:tab w:val="left" w:pos="3825"/>
+        </w:tabs>
+        <w:ind w:left="360"/>
+        <w:rPr>
+          <w:rFonts w:ascii="Times New Roman" w:hAnsi="Times New Roman" w:cs="Times New Roman"/>
+          <w:sz w:val="22"/>
+        </w:rPr>
+      </w:pPr>
+    </w:p>
+    <w:p>
+      <w:pPr>
+        <w:tabs>
+          <w:tab w:val="left" w:pos="2160"/>
+          <w:tab w:val="left" w:pos="3825"/>
+        </w:tabs>
+        <w:ind w:left="360"/>
+        <w:rPr>
+          <w:rFonts w:ascii="Times New Roman" w:hAnsi="Times New Roman" w:cs="Times New Roman"/>
+          <w:sz w:val="22"/>
+        </w:rPr>
+      </w:pPr>
+    </w:p>
+    <w:p>
+      <w:pPr>
+        <w:tabs>
+          <w:tab w:val="left" w:pos="2160"/>
+          <w:tab w:val="left" w:pos="3825"/>
+        </w:tabs>
+        <w:ind w:left="360"/>
+        <w:rPr>
+          <w:rFonts w:ascii="Times New Roman" w:hAnsi="Times New Roman" w:cs="Times New Roman"/>
+          <w:sz w:val="22"/>
+        </w:rPr>
+      </w:pPr>
+    </w:p>
+    <w:p>
+      <w:pPr>
+        <w:tabs>
+          <w:tab w:val="left" w:pos="2160"/>
+          <w:tab w:val="left" w:pos="3825"/>
+        </w:tabs>
+        <w:ind w:left="360"/>
+        <w:rPr>
+          <w:rFonts w:ascii="Times New Roman" w:hAnsi="Times New Roman" w:cs="Times New Roman"/>
+          <w:sz w:val="22"/>
+        </w:rPr>
+      </w:pPr>
+    </w:p>
+    <w:p>
+      <w:pPr>
+        <w:tabs>
+          <w:tab w:val="left" w:pos="2160"/>
+          <w:tab w:val="left" w:pos="3825"/>
+        </w:tabs>
+        <w:ind w:left="360"/>
+        <w:rPr>
+          <w:rFonts w:ascii="Times New Roman" w:hAnsi="Times New Roman" w:cs="Times New Roman"/>
+          <w:sz w:val="22"/>
+        </w:rPr>
+      </w:pPr>
+    </w:p>
+    <w:p>
+      <w:pPr>
+        <w:tabs>
+          <w:tab w:val="left" w:pos="2160"/>
+          <w:tab w:val="left" w:pos="3825"/>
+        </w:tabs>
+        <w:ind w:left="360"/>
+        <w:rPr>
+          <w:rFonts w:ascii="Times New Roman" w:hAnsi="Times New Roman" w:cs="Times New Roman"/>
+          <w:sz w:val="22"/>
+        </w:rPr>
+      </w:pPr>
+    </w:p>
+    <w:p>
+      <w:pPr>
+        <w:tabs>
+          <w:tab w:val="left" w:pos="2160"/>
+          <w:tab w:val="left" w:pos="3825"/>
+        </w:tabs>
+        <w:ind w:left="360"/>
+        <w:rPr>
+          <w:rFonts w:ascii="Times New Roman" w:hAnsi="Times New Roman" w:cs="Times New Roman"/>
+          <w:sz w:val="22"/>
+        </w:rPr>
+      </w:pPr>
+    </w:p>
+    <w:p>
+      <w:pPr>
+        <w:tabs>
+          <w:tab w:val="left" w:pos="2160"/>
+          <w:tab w:val="left" w:pos="3825"/>
+        </w:tabs>
+        <w:ind w:left="360"/>
+        <w:rPr>
+          <w:rFonts w:ascii="Times New Roman" w:hAnsi="Times New Roman" w:cs="Times New Roman"/>
+          <w:sz w:val="22"/>
+        </w:rPr>
+      </w:pPr>
+    </w:p>
+    <w:p>
+      <w:pPr>
+        <w:tabs>
+          <w:tab w:val="left" w:pos="2160"/>
+          <w:tab w:val="left" w:pos="3825"/>
+        </w:tabs>
+        <w:ind w:left="360"/>
+        <w:rPr>
+          <w:rFonts w:ascii="Times New Roman" w:hAnsi="Times New Roman" w:cs="Times New Roman"/>
+          <w:sz w:val="22"/>
+        </w:rPr>
+      </w:pPr>
+    </w:p>
+    <w:p>
+      <w:pPr>
+        <w:tabs>
+          <w:tab w:val="left" w:pos="2160"/>
+          <w:tab w:val="left" w:pos="3825"/>
+        </w:tabs>
+        <w:ind w:left="360"/>
+        <w:rPr>
+          <w:rFonts w:ascii="Times New Roman" w:hAnsi="Times New Roman" w:cs="Times New Roman"/>
+          <w:sz w:val="22"/>
+        </w:rPr>
+      </w:pPr>
+    </w:p>
+    <w:p>
+      <w:pPr>
+        <w:tabs>
+          <w:tab w:val="left" w:pos="2160"/>
+          <w:tab w:val="left" w:pos="3825"/>
+        </w:tabs>
+        <w:ind w:left="360"/>
+        <w:rPr>
+          <w:rFonts w:ascii="Times New Roman" w:hAnsi="Times New Roman" w:cs="Times New Roman"/>
+          <w:sz w:val="22"/>
+        </w:rPr>
+      </w:pPr>
+    </w:p>
+    <w:p>
+      <w:pPr>
+        <w:tabs>
+          <w:tab w:val="left" w:pos="2160"/>
+          <w:tab w:val="left" w:pos="3825"/>
+        </w:tabs>
+        <w:ind w:left="360"/>
+        <w:rPr>
+          <w:rFonts w:ascii="Times New Roman" w:hAnsi="Times New Roman" w:cs="Times New Roman"/>
+          <w:sz w:val="22"/>
+        </w:rPr>
+      </w:pPr>
+    </w:p>
+    <w:p>
+      <w:pPr>
+        <w:tabs>
+          <w:tab w:val="left" w:pos="2160"/>
+          <w:tab w:val="left" w:pos="3825"/>
+        </w:tabs>
+        <w:ind w:left="360"/>
+        <w:rPr>
+          <w:rFonts w:ascii="Times New Roman" w:hAnsi="Times New Roman" w:cs="Times New Roman"/>
+          <w:sz w:val="22"/>
+        </w:rPr>
+      </w:pPr>
+    </w:p>
+    <w:p>
+      <w:pPr>
+        <w:tabs>
+          <w:tab w:val="left" w:pos="2160"/>
+          <w:tab w:val="left" w:pos="3825"/>
+        </w:tabs>
+        <w:ind w:left="360"/>
+        <w:jc w:val="center"/>
+        <w:rPr>
+          <w:rFonts w:ascii="Times New Roman" w:hAnsi="Times New Roman" w:cs="Times New Roman"/>
+          <w:sz w:val="22"/>
+        </w:rPr>
+      </w:pPr>
+      <w:r>
+        <w:rPr>
+          <w:rFonts w:ascii="Times New Roman" w:hAnsi="Times New Roman" w:cs="Times New Roman"/>
+          <w:sz w:val="22"/>
+        </w:rPr>
+        <w:lastRenderedPageBreak/>
+        <w:t>Тема 3. Производственная и организационная структура предприятия</w:t>
+      </w:r>
+    </w:p>
+    <w:p>
+      <w:pPr>
+        <w:tabs>
+          <w:tab w:val="left" w:pos="2160"/>
+          <w:tab w:val="left" w:pos="3825"/>
+        </w:tabs>
+        <w:ind w:left="360"/>
+        <w:rPr>
+          <w:rFonts w:ascii="Times New Roman" w:hAnsi="Times New Roman" w:cs="Times New Roman"/>
+          <w:sz w:val="22"/>
+        </w:rPr>
+      </w:pPr>
+      <w:r>
+        <w:rPr>
+          <w:rFonts w:ascii="Times New Roman" w:hAnsi="Times New Roman" w:cs="Times New Roman"/>
+          <w:sz w:val="22"/>
+        </w:rPr>
+        <w:drawing>
+          <wp:inline distT="0" distB="0" distL="0" distR="0" wp14:anchorId="086E1734" wp14:editId="20BB746B">
+            <wp:extent cx="5940425" cy="3552825"/>
+            <wp:effectExtent l="0" t="0" r="3175" b="9525"/>
+            <wp:docPr id="1" name="Рисунок 1"/>
+            <wp:cNvGraphicFramePr>
+              <a:graphicFrameLocks xmlns:a="http://schemas.openxmlformats.org/drawingml/2006/main" noChangeAspect="1"/>
+            </wp:cNvGraphicFramePr>
+            <a:graphic xmlns:a="http://schemas.openxmlformats.org/drawingml/2006/main">
+              <a:graphicData uri="http://schemas.openxmlformats.org/drawingml/2006/picture">
+                <pic:pic xmlns:pic="http://schemas.openxmlformats.org/drawingml/2006/picture">
+                  <pic:nvPicPr>
+                    <pic:cNvPr id="1" name=""/>
+                    <pic:cNvPicPr/>
+                  </pic:nvPicPr>
+                  <pic:blipFill>
+                    <a:blip r:embed="rId6"/>
+                    <a:stretch>
+                      <a:fillRect/>
+                    </a:stretch>
+                  </pic:blipFill>
+                  <pic:spPr>
+                    <a:xfrm>
+                      <a:off x="0" y="0"/>
+                      <a:ext cx="5940425" cy="3552825"/>
+                    </a:xfrm>
+                    <a:prstGeom prst="rect">
+                      <a:avLst/>
+                    </a:prstGeom>
+                  </pic:spPr>
+                </pic:pic>
+              </a:graphicData>
+            </a:graphic>
+          </wp:inline>
+        </w:drawing>
+      </w:r>
+    </w:p>
+    <w:p>
+      <w:pPr>
+        <w:tabs>
+          <w:tab w:val="left" w:pos="2160"/>
+          <w:tab w:val="left" w:pos="3825"/>
+        </w:tabs>
+        <w:ind w:left="360"/>
+        <w:jc w:val="center"/>
+        <w:rPr>
+          <w:rFonts w:ascii="Times New Roman" w:hAnsi="Times New Roman" w:cs="Times New Roman"/>
+          <w:sz w:val="22"/>
+        </w:rPr>
+      </w:pPr>
+    </w:p>
+    <w:p>
+      <w:pPr>
+        <w:tabs>
+          <w:tab w:val="left" w:pos="2160"/>
+          <w:tab w:val="left" w:pos="3825"/>
+        </w:tabs>
+        <w:ind w:left="360"/>
+        <w:rPr>
+          <w:rFonts w:ascii="Times New Roman" w:hAnsi="Times New Roman" w:cs="Times New Roman"/>
+          <w:sz w:val="22"/>
+        </w:rPr>
+      </w:pPr>
+    </w:p>
+    <w:p>
+      <w:pPr>
+        <w:tabs>
+          <w:tab w:val="left" w:pos="2160"/>
+          <w:tab w:val="left" w:pos="3825"/>
+        </w:tabs>
+        <w:ind w:left="360"/>
+        <w:rPr>
+          <w:rFonts w:ascii="Times New Roman" w:hAnsi="Times New Roman" w:cs="Times New Roman"/>
+          <w:sz w:val="22"/>
+        </w:rPr>
+      </w:pPr>
+      <w:r>
+        <w:rPr>
+          <w:rFonts w:ascii="Times New Roman" w:hAnsi="Times New Roman" w:cs="Times New Roman"/>
+          <w:b/>
+          <w:sz w:val="22"/>
+        </w:rPr>
+        <w:t>Производственный процесс</w:t>
+      </w:r>
+      <w:r>
+        <w:rPr>
+          <w:rFonts w:ascii="Times New Roman" w:hAnsi="Times New Roman" w:cs="Times New Roman"/>
+          <w:sz w:val="22"/>
+        </w:rPr>
+        <w:t xml:space="preserve"> – совокупность действий по созданию продукции (работ, услуг), количественное и качественное соединение в пространстве и во времени средств производства и трудовых ресурсов.</w:t>
+      </w:r>
+    </w:p>
+    <w:p>
+      <w:pPr>
+        <w:tabs>
+          <w:tab w:val="left" w:pos="2160"/>
+          <w:tab w:val="left" w:pos="3825"/>
+        </w:tabs>
+        <w:ind w:left="360"/>
+        <w:rPr>
+          <w:rFonts w:ascii="Times New Roman" w:hAnsi="Times New Roman" w:cs="Times New Roman"/>
+          <w:sz w:val="22"/>
+        </w:rPr>
+      </w:pPr>
+    </w:p>
+    <w:p>
+      <w:pPr>
+        <w:tabs>
+          <w:tab w:val="left" w:pos="2160"/>
+          <w:tab w:val="left" w:pos="3825"/>
+        </w:tabs>
+        <w:ind w:left="360"/>
+        <w:rPr>
+          <w:rFonts w:ascii="Times New Roman" w:hAnsi="Times New Roman" w:cs="Times New Roman"/>
+          <w:b/>
+          <w:sz w:val="22"/>
+        </w:rPr>
+      </w:pPr>
+      <w:r>
+        <w:rPr>
+          <w:rFonts w:ascii="Times New Roman" w:hAnsi="Times New Roman" w:cs="Times New Roman"/>
+          <w:b/>
+          <w:sz w:val="22"/>
+        </w:rPr>
+        <w:t>Основные цели управления производством:</w:t>
+      </w:r>
+    </w:p>
+    <w:p>
+      <w:pPr>
+        <w:pStyle w:val="a3"/>
+        <w:numPr>
+          <w:ilvl w:val="0"/>
+          <w:numId w:val="35"/>
+        </w:numPr>
+        <w:tabs>
+          <w:tab w:val="left" w:pos="2160"/>
+          <w:tab w:val="left" w:pos="3825"/>
+        </w:tabs>
+        <w:rPr>
+          <w:rFonts w:ascii="Times New Roman" w:hAnsi="Times New Roman" w:cs="Times New Roman"/>
+          <w:sz w:val="22"/>
+        </w:rPr>
+      </w:pPr>
+      <w:r>
+        <w:rPr>
+          <w:rFonts w:ascii="Times New Roman" w:hAnsi="Times New Roman" w:cs="Times New Roman"/>
+          <w:sz w:val="22"/>
+        </w:rPr>
+        <w:t>Совершенствование организационной структуры управления производством</w:t>
+      </w:r>
+    </w:p>
+    <w:p>
+      <w:pPr>
+        <w:pStyle w:val="a3"/>
+        <w:numPr>
+          <w:ilvl w:val="0"/>
+          <w:numId w:val="35"/>
+        </w:numPr>
+        <w:tabs>
+          <w:tab w:val="left" w:pos="2160"/>
+          <w:tab w:val="left" w:pos="3825"/>
+        </w:tabs>
+        <w:rPr>
+          <w:rFonts w:ascii="Times New Roman" w:hAnsi="Times New Roman" w:cs="Times New Roman"/>
+          <w:sz w:val="22"/>
+        </w:rPr>
+      </w:pPr>
+      <w:r>
+        <w:rPr>
+          <w:rFonts w:ascii="Times New Roman" w:hAnsi="Times New Roman" w:cs="Times New Roman"/>
+          <w:sz w:val="22"/>
+        </w:rPr>
+        <w:t>Достижение минимальных затрат материалов, труда, времени денежных средств</w:t>
+      </w:r>
+    </w:p>
+    <w:p>
+      <w:pPr>
+        <w:pStyle w:val="a3"/>
+        <w:numPr>
+          <w:ilvl w:val="0"/>
+          <w:numId w:val="35"/>
+        </w:numPr>
+        <w:tabs>
+          <w:tab w:val="left" w:pos="2160"/>
+          <w:tab w:val="left" w:pos="3825"/>
+        </w:tabs>
+        <w:rPr>
+          <w:rFonts w:ascii="Times New Roman" w:hAnsi="Times New Roman" w:cs="Times New Roman"/>
+          <w:sz w:val="22"/>
+        </w:rPr>
+      </w:pPr>
+      <w:r>
+        <w:rPr>
+          <w:rFonts w:ascii="Times New Roman" w:hAnsi="Times New Roman" w:cs="Times New Roman"/>
+          <w:sz w:val="22"/>
+        </w:rPr>
+        <w:t>Устранение непроизводительных потерь времени рабочих и служащих</w:t>
+      </w:r>
+    </w:p>
+    <w:p>
+      <w:pPr>
+        <w:pStyle w:val="a3"/>
+        <w:numPr>
+          <w:ilvl w:val="0"/>
+          <w:numId w:val="35"/>
+        </w:numPr>
+        <w:tabs>
+          <w:tab w:val="left" w:pos="2160"/>
+          <w:tab w:val="left" w:pos="3825"/>
+        </w:tabs>
+        <w:rPr>
+          <w:rFonts w:ascii="Times New Roman" w:hAnsi="Times New Roman" w:cs="Times New Roman"/>
+          <w:sz w:val="22"/>
+        </w:rPr>
+      </w:pPr>
+      <w:r>
+        <w:rPr>
+          <w:rFonts w:ascii="Times New Roman" w:hAnsi="Times New Roman" w:cs="Times New Roman"/>
+          <w:sz w:val="22"/>
+        </w:rPr>
+        <w:t>Выполнение заданной программы выпуска продукции</w:t>
+      </w:r>
+    </w:p>
+    <w:p>
+      <w:pPr>
+        <w:tabs>
+          <w:tab w:val="left" w:pos="2160"/>
+          <w:tab w:val="left" w:pos="3825"/>
+        </w:tabs>
+        <w:ind w:left="360"/>
+        <w:rPr>
+          <w:rFonts w:ascii="Times New Roman" w:hAnsi="Times New Roman" w:cs="Times New Roman"/>
+          <w:sz w:val="22"/>
+        </w:rPr>
+      </w:pPr>
+      <w:r>
+        <w:rPr>
+          <w:rFonts w:ascii="Times New Roman" w:hAnsi="Times New Roman" w:cs="Times New Roman"/>
+          <w:sz w:val="22"/>
+        </w:rPr>
+        <w:t>Для достижения намеченных целей необходимо осуществление широкого комплекса технических, технологических, организационно-управленческих мероприятий:</w:t>
+      </w:r>
+    </w:p>
+    <w:p>
+      <w:pPr>
+        <w:pStyle w:val="a3"/>
+        <w:numPr>
+          <w:ilvl w:val="0"/>
+          <w:numId w:val="36"/>
+        </w:numPr>
+        <w:tabs>
+          <w:tab w:val="left" w:pos="2160"/>
+          <w:tab w:val="left" w:pos="3825"/>
+        </w:tabs>
+        <w:rPr>
+          <w:rFonts w:ascii="Times New Roman" w:hAnsi="Times New Roman" w:cs="Times New Roman"/>
+          <w:sz w:val="22"/>
+        </w:rPr>
+      </w:pPr>
+      <w:r>
+        <w:rPr>
+          <w:rFonts w:ascii="Times New Roman" w:hAnsi="Times New Roman" w:cs="Times New Roman"/>
+          <w:sz w:val="22"/>
+        </w:rPr>
+        <w:t xml:space="preserve">Разработка принципов инвестиционной и технической политики для фирмы в целом </w:t>
+      </w:r>
+    </w:p>
+    <w:p>
+      <w:pPr>
+        <w:pStyle w:val="a3"/>
+        <w:numPr>
+          <w:ilvl w:val="0"/>
+          <w:numId w:val="36"/>
+        </w:numPr>
+        <w:tabs>
+          <w:tab w:val="left" w:pos="2160"/>
+          <w:tab w:val="left" w:pos="3825"/>
+        </w:tabs>
+        <w:rPr>
+          <w:rFonts w:ascii="Times New Roman" w:hAnsi="Times New Roman" w:cs="Times New Roman"/>
+          <w:sz w:val="22"/>
+        </w:rPr>
+      </w:pPr>
+      <w:r>
+        <w:rPr>
+          <w:rFonts w:ascii="Times New Roman" w:hAnsi="Times New Roman" w:cs="Times New Roman"/>
+          <w:sz w:val="22"/>
+        </w:rPr>
+        <w:t>Концентрация усилий и ресурсов на развитии наиболее перспективных областей технологического процесса.</w:t>
+      </w:r>
+    </w:p>
+    <w:p>
+      <w:pPr>
+        <w:pStyle w:val="a3"/>
+        <w:numPr>
+          <w:ilvl w:val="0"/>
+          <w:numId w:val="36"/>
+        </w:numPr>
+        <w:tabs>
+          <w:tab w:val="left" w:pos="2160"/>
+          <w:tab w:val="left" w:pos="3825"/>
+        </w:tabs>
+        <w:rPr>
+          <w:rFonts w:ascii="Times New Roman" w:hAnsi="Times New Roman" w:cs="Times New Roman"/>
+          <w:sz w:val="22"/>
+        </w:rPr>
+      </w:pPr>
+      <w:r>
+        <w:rPr>
+          <w:rFonts w:ascii="Times New Roman" w:hAnsi="Times New Roman" w:cs="Times New Roman"/>
+          <w:sz w:val="22"/>
+        </w:rPr>
+        <w:t>Создание производственных систем нового поколения, работающих с применением ЭВМ.</w:t>
+      </w:r>
+    </w:p>
+    <w:p>
+      <w:pPr>
+        <w:tabs>
+          <w:tab w:val="left" w:pos="2160"/>
+          <w:tab w:val="left" w:pos="3825"/>
+        </w:tabs>
+        <w:ind w:left="360"/>
+        <w:rPr>
+          <w:rFonts w:ascii="Times New Roman" w:hAnsi="Times New Roman" w:cs="Times New Roman"/>
+          <w:b/>
+          <w:sz w:val="22"/>
+        </w:rPr>
+      </w:pPr>
+      <w:r>
+        <w:rPr>
+          <w:rFonts w:ascii="Times New Roman" w:hAnsi="Times New Roman" w:cs="Times New Roman"/>
+          <w:b/>
+          <w:sz w:val="22"/>
+        </w:rPr>
+        <w:t>Основные задачи управления производством:</w:t>
+      </w:r>
+    </w:p>
+    <w:p>
+      <w:pPr>
+        <w:pStyle w:val="a3"/>
+        <w:numPr>
+          <w:ilvl w:val="0"/>
+          <w:numId w:val="37"/>
+        </w:numPr>
+        <w:tabs>
+          <w:tab w:val="left" w:pos="2160"/>
+          <w:tab w:val="left" w:pos="3825"/>
+        </w:tabs>
+        <w:rPr>
+          <w:rFonts w:ascii="Times New Roman" w:hAnsi="Times New Roman" w:cs="Times New Roman"/>
+          <w:sz w:val="22"/>
+        </w:rPr>
+      </w:pPr>
+      <w:r>
+        <w:rPr>
+          <w:rFonts w:ascii="Times New Roman" w:hAnsi="Times New Roman" w:cs="Times New Roman"/>
+          <w:sz w:val="22"/>
+        </w:rPr>
+        <w:t>Удовлетворение потребительского спроса. На выходе производство должно иметь некий товар, который должен удовлетворить потребителя стоимостью товара, временем и сроками его предоставления.</w:t>
+      </w:r>
+    </w:p>
+    <w:p>
+      <w:pPr>
+        <w:pStyle w:val="a3"/>
+        <w:numPr>
+          <w:ilvl w:val="0"/>
+          <w:numId w:val="37"/>
+        </w:numPr>
+        <w:tabs>
+          <w:tab w:val="left" w:pos="2160"/>
+          <w:tab w:val="left" w:pos="3825"/>
+        </w:tabs>
+        <w:rPr>
+          <w:rFonts w:ascii="Times New Roman" w:hAnsi="Times New Roman" w:cs="Times New Roman"/>
+          <w:sz w:val="22"/>
+        </w:rPr>
+      </w:pPr>
+      <w:r>
+        <w:rPr>
+          <w:rFonts w:ascii="Times New Roman" w:hAnsi="Times New Roman" w:cs="Times New Roman"/>
+          <w:sz w:val="22"/>
+        </w:rPr>
+        <w:lastRenderedPageBreak/>
+        <w:t>Эффективная переработка ресурсов-экономного и сбалансированного использования ресурсов можно при наличии слаженного производственного менеджмента.</w:t>
+      </w:r>
+    </w:p>
+    <w:p>
+      <w:pPr>
+        <w:tabs>
+          <w:tab w:val="left" w:pos="2160"/>
+          <w:tab w:val="left" w:pos="3825"/>
+        </w:tabs>
+        <w:ind w:left="360"/>
+        <w:rPr>
+          <w:rFonts w:ascii="Times New Roman" w:hAnsi="Times New Roman" w:cs="Times New Roman"/>
+          <w:b/>
+          <w:sz w:val="22"/>
+        </w:rPr>
+      </w:pPr>
+      <w:r>
+        <w:rPr>
+          <w:rFonts w:ascii="Times New Roman" w:hAnsi="Times New Roman" w:cs="Times New Roman"/>
+          <w:b/>
+          <w:sz w:val="22"/>
+        </w:rPr>
+        <w:t xml:space="preserve">Производственный процесс состоит из следующих элементов </w:t>
+      </w:r>
+    </w:p>
+    <w:p>
+      <w:pPr>
+        <w:pStyle w:val="a3"/>
+        <w:numPr>
+          <w:ilvl w:val="0"/>
+          <w:numId w:val="39"/>
+        </w:numPr>
+        <w:tabs>
+          <w:tab w:val="left" w:pos="2160"/>
+          <w:tab w:val="left" w:pos="3825"/>
+        </w:tabs>
+        <w:rPr>
+          <w:rFonts w:ascii="Times New Roman" w:hAnsi="Times New Roman" w:cs="Times New Roman"/>
+          <w:sz w:val="22"/>
+        </w:rPr>
+      </w:pPr>
+      <w:r>
+        <w:rPr>
+          <w:rFonts w:ascii="Times New Roman" w:hAnsi="Times New Roman" w:cs="Times New Roman"/>
+          <w:sz w:val="22"/>
+        </w:rPr>
+        <w:t>Средства производства (имущество организации)</w:t>
+      </w:r>
+    </w:p>
+    <w:p>
+      <w:pPr>
+        <w:pStyle w:val="a3"/>
+        <w:numPr>
+          <w:ilvl w:val="0"/>
+          <w:numId w:val="39"/>
+        </w:numPr>
+        <w:tabs>
+          <w:tab w:val="left" w:pos="2160"/>
+          <w:tab w:val="left" w:pos="3825"/>
+        </w:tabs>
+        <w:rPr>
+          <w:rFonts w:ascii="Times New Roman" w:hAnsi="Times New Roman" w:cs="Times New Roman"/>
+          <w:sz w:val="22"/>
+        </w:rPr>
+      </w:pPr>
+      <w:r>
+        <w:rPr>
+          <w:rFonts w:ascii="Times New Roman" w:hAnsi="Times New Roman" w:cs="Times New Roman"/>
+          <w:sz w:val="22"/>
+        </w:rPr>
+        <w:t>Трудовые ресурсы – совокупность физических и умственных способностей человека, которые он использует для производства благ и услуг.</w:t>
+      </w:r>
+    </w:p>
+    <w:p>
+      <w:pPr>
+        <w:pStyle w:val="a3"/>
+        <w:numPr>
+          <w:ilvl w:val="0"/>
+          <w:numId w:val="39"/>
+        </w:numPr>
+        <w:tabs>
+          <w:tab w:val="left" w:pos="2160"/>
+          <w:tab w:val="left" w:pos="3825"/>
+        </w:tabs>
+        <w:rPr>
+          <w:rFonts w:ascii="Times New Roman" w:hAnsi="Times New Roman" w:cs="Times New Roman"/>
+          <w:sz w:val="22"/>
+        </w:rPr>
+      </w:pPr>
+      <w:r>
+        <w:rPr>
+          <w:rFonts w:ascii="Times New Roman" w:hAnsi="Times New Roman" w:cs="Times New Roman"/>
+          <w:sz w:val="22"/>
+        </w:rPr>
+        <w:t>Предметы труда (оборотный капитал) – то, что преобразуется в процессе труда (сырье, материалы, полуфабрикаты).</w:t>
+      </w:r>
+    </w:p>
+    <w:p>
+      <w:pPr>
+        <w:pStyle w:val="a3"/>
+        <w:numPr>
+          <w:ilvl w:val="0"/>
+          <w:numId w:val="39"/>
+        </w:numPr>
+        <w:tabs>
+          <w:tab w:val="left" w:pos="2160"/>
+          <w:tab w:val="left" w:pos="3825"/>
+        </w:tabs>
+        <w:rPr>
+          <w:rFonts w:ascii="Times New Roman" w:hAnsi="Times New Roman" w:cs="Times New Roman"/>
+          <w:sz w:val="22"/>
+        </w:rPr>
+      </w:pPr>
+      <w:r>
+        <w:rPr>
+          <w:rFonts w:ascii="Times New Roman" w:hAnsi="Times New Roman" w:cs="Times New Roman"/>
+          <w:sz w:val="22"/>
+        </w:rPr>
+        <w:t xml:space="preserve">Средства труда (основной капитал) – орудия труда, с использованием которых работник воздействует на предмет труда. </w:t>
+      </w:r>
+    </w:p>
+    <w:p>
+      <w:pPr>
+        <w:tabs>
+          <w:tab w:val="left" w:pos="2160"/>
+          <w:tab w:val="left" w:pos="3825"/>
+        </w:tabs>
+        <w:rPr>
+          <w:rFonts w:ascii="Times New Roman" w:hAnsi="Times New Roman" w:cs="Times New Roman"/>
+          <w:b/>
+          <w:sz w:val="22"/>
+        </w:rPr>
+      </w:pPr>
+      <w:r>
+        <w:rPr>
+          <w:rFonts w:ascii="Times New Roman" w:hAnsi="Times New Roman" w:cs="Times New Roman"/>
+          <w:b/>
+          <w:sz w:val="22"/>
+        </w:rPr>
+        <w:t>Типы организации производства</w:t>
+      </w:r>
+    </w:p>
+    <w:p>
+      <w:pPr>
+        <w:tabs>
+          <w:tab w:val="left" w:pos="2160"/>
+          <w:tab w:val="left" w:pos="3825"/>
+        </w:tabs>
+        <w:rPr>
+          <w:rFonts w:ascii="Times New Roman" w:hAnsi="Times New Roman" w:cs="Times New Roman"/>
+          <w:sz w:val="22"/>
+        </w:rPr>
+      </w:pPr>
+      <w:r>
+        <w:rPr>
+          <w:rFonts w:ascii="Times New Roman" w:hAnsi="Times New Roman" w:cs="Times New Roman"/>
+          <w:sz w:val="22"/>
+        </w:rPr>
+        <w:t>Тип организации производственного процесса – совокупность организационно-технических и экономических особенностей производства, обусловленных номенклатурой, объемами и степенью регулярности выпуска одноименной продукции.</w:t>
+      </w:r>
+    </w:p>
+    <w:p>
+      <w:pPr>
+        <w:tabs>
+          <w:tab w:val="left" w:pos="2160"/>
+          <w:tab w:val="left" w:pos="3825"/>
+        </w:tabs>
+        <w:rPr>
+          <w:rFonts w:ascii="Times New Roman" w:hAnsi="Times New Roman" w:cs="Times New Roman"/>
+          <w:sz w:val="22"/>
+        </w:rPr>
+      </w:pPr>
+      <w:r>
+        <w:rPr>
+          <w:rFonts w:ascii="Times New Roman" w:hAnsi="Times New Roman" w:cs="Times New Roman"/>
+          <w:sz w:val="22"/>
+        </w:rPr>
+        <w:t>Тип производства – это понятие, которое дает комплексную характеристику производственному процессу и отражает особенности организации, техники и экономики производства. Это понятие отражает широту номенклатуры, уровень специализации, объем производства, стабильность выпуска и т. д.</w:t>
+      </w:r>
+    </w:p>
+    <w:p>
+      <w:pPr>
+        <w:tabs>
+          <w:tab w:val="left" w:pos="2160"/>
+          <w:tab w:val="left" w:pos="3825"/>
+        </w:tabs>
+        <w:rPr>
+          <w:rFonts w:ascii="Times New Roman" w:hAnsi="Times New Roman" w:cs="Times New Roman"/>
+          <w:sz w:val="22"/>
+        </w:rPr>
+      </w:pPr>
+    </w:p>
+    <w:p>
+      <w:pPr>
+        <w:tabs>
+          <w:tab w:val="left" w:pos="2160"/>
+          <w:tab w:val="left" w:pos="3825"/>
+        </w:tabs>
+        <w:rPr>
+          <w:rFonts w:ascii="Times New Roman" w:hAnsi="Times New Roman" w:cs="Times New Roman"/>
+          <w:b/>
+          <w:sz w:val="22"/>
+        </w:rPr>
+      </w:pPr>
+      <w:r>
+        <w:rPr>
+          <w:rFonts w:ascii="Times New Roman" w:hAnsi="Times New Roman" w:cs="Times New Roman"/>
+          <w:b/>
+          <w:sz w:val="22"/>
+        </w:rPr>
+        <w:t>Различают три типа производства</w:t>
+      </w:r>
+    </w:p>
+    <w:tbl>
+      <w:tblPr>
+        <w:tblStyle w:val="af4"/>
+        <w:tblW w:w="0" w:type="auto"/>
+        <w:tblLook w:val="04A0" w:firstRow="1" w:lastRow="0" w:firstColumn="1" w:lastColumn="0" w:noHBand="0" w:noVBand="1"/>
+      </w:tblPr>
+      <w:tblGrid>
+        <w:gridCol w:w="3115"/>
+        <w:gridCol w:w="3115"/>
+        <w:gridCol w:w="3115"/>
+      </w:tblGrid>
+      <w:tr>
+        <w:tc>
+          <w:tcPr>
+            <w:tcW w:w="3115" w:type="dxa"/>
+          </w:tcPr>
+          <w:p>
+            <w:pPr>
+              <w:tabs>
+                <w:tab w:val="left" w:pos="2160"/>
+                <w:tab w:val="left" w:pos="3825"/>
+              </w:tabs>
+              <w:rPr>
+                <w:rFonts w:ascii="Times New Roman" w:hAnsi="Times New Roman" w:cs="Times New Roman"/>
+                <w:b/>
+                <w:sz w:val="22"/>
+              </w:rPr>
+            </w:pPr>
+            <w:r>
+              <w:rPr>
+                <w:rFonts w:ascii="Times New Roman" w:hAnsi="Times New Roman" w:cs="Times New Roman"/>
+                <w:b/>
+                <w:sz w:val="22"/>
+              </w:rPr>
+              <w:t>Единичное производство</w:t>
+            </w:r>
+          </w:p>
+        </w:tc>
+        <w:tc>
+          <w:tcPr>
+            <w:tcW w:w="3115" w:type="dxa"/>
+          </w:tcPr>
+          <w:p>
+            <w:pPr>
+              <w:tabs>
+                <w:tab w:val="left" w:pos="2160"/>
+                <w:tab w:val="left" w:pos="3825"/>
+              </w:tabs>
+              <w:rPr>
+                <w:rFonts w:ascii="Times New Roman" w:hAnsi="Times New Roman" w:cs="Times New Roman"/>
+                <w:b/>
+                <w:sz w:val="22"/>
+              </w:rPr>
+            </w:pPr>
+            <w:r>
+              <w:rPr>
+                <w:rFonts w:ascii="Times New Roman" w:hAnsi="Times New Roman" w:cs="Times New Roman"/>
+                <w:b/>
+                <w:sz w:val="22"/>
+              </w:rPr>
+              <w:t>Серийное производство</w:t>
+            </w:r>
+          </w:p>
+        </w:tc>
+        <w:tc>
+          <w:tcPr>
+            <w:tcW w:w="3115" w:type="dxa"/>
+          </w:tcPr>
+          <w:p>
+            <w:pPr>
+              <w:tabs>
+                <w:tab w:val="left" w:pos="2160"/>
+                <w:tab w:val="left" w:pos="3825"/>
+              </w:tabs>
+              <w:rPr>
+                <w:rFonts w:ascii="Times New Roman" w:hAnsi="Times New Roman" w:cs="Times New Roman"/>
+                <w:b/>
+                <w:sz w:val="22"/>
+              </w:rPr>
+            </w:pPr>
+            <w:r>
+              <w:rPr>
+                <w:rFonts w:ascii="Times New Roman" w:hAnsi="Times New Roman" w:cs="Times New Roman"/>
+                <w:b/>
+                <w:sz w:val="22"/>
+              </w:rPr>
+              <w:t>Массовое производство</w:t>
+            </w:r>
+          </w:p>
+        </w:tc>
+      </w:tr>
+      <w:tr>
+        <w:tc>
+          <w:tcPr>
+            <w:tcW w:w="3115" w:type="dxa"/>
+          </w:tcPr>
+          <w:p>
+            <w:pPr>
+              <w:tabs>
+                <w:tab w:val="left" w:pos="2160"/>
+                <w:tab w:val="left" w:pos="3825"/>
+              </w:tabs>
+              <w:rPr>
+                <w:rFonts w:ascii="Times New Roman" w:hAnsi="Times New Roman" w:cs="Times New Roman"/>
+                <w:sz w:val="22"/>
+              </w:rPr>
+            </w:pPr>
+            <w:r>
+              <w:rPr>
+                <w:rFonts w:ascii="Times New Roman" w:hAnsi="Times New Roman" w:cs="Times New Roman"/>
+                <w:sz w:val="22"/>
+              </w:rPr>
+              <w:t>Широкий ассортимент продукции и штучным объемом выпуска ее. Значительное незавершенное производство. Используется универсальное оборудование, работники обладают высокой квалификацией.</w:t>
+            </w:r>
+          </w:p>
+          <w:p>
+            <w:pPr>
+              <w:tabs>
+                <w:tab w:val="left" w:pos="2160"/>
+                <w:tab w:val="left" w:pos="3825"/>
+              </w:tabs>
+              <w:rPr>
+                <w:rFonts w:ascii="Times New Roman" w:hAnsi="Times New Roman" w:cs="Times New Roman"/>
+                <w:sz w:val="22"/>
+              </w:rPr>
+            </w:pPr>
+          </w:p>
+          <w:p>
+            <w:pPr>
+              <w:tabs>
+                <w:tab w:val="left" w:pos="2160"/>
+                <w:tab w:val="left" w:pos="3825"/>
+              </w:tabs>
+              <w:rPr>
+                <w:rFonts w:ascii="Times New Roman" w:hAnsi="Times New Roman" w:cs="Times New Roman"/>
+                <w:sz w:val="22"/>
+              </w:rPr>
+            </w:pPr>
+            <w:r>
+              <w:rPr>
+                <w:rFonts w:ascii="Times New Roman" w:hAnsi="Times New Roman" w:cs="Times New Roman"/>
+                <w:sz w:val="22"/>
+              </w:rPr>
+              <w:t>Высокий удельный вес ручных операций и трудоемкости изделий, длительный цикл изготовления, высокая стоимость выпускаемой продукции.</w:t>
+            </w:r>
+          </w:p>
+          <w:p>
+            <w:pPr>
+              <w:tabs>
+                <w:tab w:val="left" w:pos="2160"/>
+                <w:tab w:val="left" w:pos="3825"/>
+              </w:tabs>
+              <w:rPr>
+                <w:rFonts w:ascii="Times New Roman" w:hAnsi="Times New Roman" w:cs="Times New Roman"/>
+                <w:sz w:val="22"/>
+              </w:rPr>
+            </w:pPr>
+          </w:p>
+        </w:tc>
+        <w:tc>
+          <w:tcPr>
+            <w:tcW w:w="3115" w:type="dxa"/>
+          </w:tcPr>
+          <w:p>
+            <w:pPr>
+              <w:tabs>
+                <w:tab w:val="left" w:pos="2160"/>
+                <w:tab w:val="left" w:pos="3825"/>
+              </w:tabs>
+              <w:rPr>
+                <w:rFonts w:ascii="Times New Roman" w:hAnsi="Times New Roman" w:cs="Times New Roman"/>
+                <w:sz w:val="22"/>
+              </w:rPr>
+            </w:pPr>
+            <w:r>
+              <w:rPr>
+                <w:rFonts w:ascii="Times New Roman" w:hAnsi="Times New Roman" w:cs="Times New Roman"/>
+                <w:sz w:val="22"/>
+              </w:rPr>
+              <w:t xml:space="preserve">Широкая номенклатура изделий, но изготавливаемых партиями. </w:t>
+            </w:r>
+          </w:p>
+          <w:p>
+            <w:pPr>
+              <w:tabs>
+                <w:tab w:val="left" w:pos="2160"/>
+                <w:tab w:val="left" w:pos="3825"/>
+              </w:tabs>
+              <w:rPr>
+                <w:rFonts w:ascii="Times New Roman" w:hAnsi="Times New Roman" w:cs="Times New Roman"/>
+                <w:sz w:val="22"/>
+              </w:rPr>
+            </w:pPr>
+          </w:p>
+          <w:p>
+            <w:pPr>
+              <w:tabs>
+                <w:tab w:val="left" w:pos="2160"/>
+                <w:tab w:val="left" w:pos="3825"/>
+              </w:tabs>
+              <w:rPr>
+                <w:rFonts w:ascii="Times New Roman" w:hAnsi="Times New Roman" w:cs="Times New Roman"/>
+                <w:sz w:val="22"/>
+              </w:rPr>
+            </w:pPr>
+            <w:r>
+              <w:rPr>
+                <w:rFonts w:ascii="Times New Roman" w:hAnsi="Times New Roman" w:cs="Times New Roman"/>
+                <w:sz w:val="22"/>
+              </w:rPr>
+              <w:t>Ограниченный ассортимент однородной продукции повторяется через определенные промежутки времени.</w:t>
+            </w:r>
+          </w:p>
+          <w:p>
+            <w:pPr>
+              <w:tabs>
+                <w:tab w:val="left" w:pos="2160"/>
+                <w:tab w:val="left" w:pos="3825"/>
+              </w:tabs>
+              <w:rPr>
+                <w:rFonts w:ascii="Times New Roman" w:hAnsi="Times New Roman" w:cs="Times New Roman"/>
+                <w:sz w:val="22"/>
+              </w:rPr>
+            </w:pPr>
+          </w:p>
+          <w:p>
+            <w:pPr>
+              <w:tabs>
+                <w:tab w:val="left" w:pos="2160"/>
+                <w:tab w:val="left" w:pos="3825"/>
+              </w:tabs>
+              <w:rPr>
+                <w:rFonts w:ascii="Times New Roman" w:hAnsi="Times New Roman" w:cs="Times New Roman"/>
+                <w:sz w:val="22"/>
+              </w:rPr>
+            </w:pPr>
+            <w:r>
+              <w:rPr>
+                <w:rFonts w:ascii="Times New Roman" w:hAnsi="Times New Roman" w:cs="Times New Roman"/>
+                <w:sz w:val="22"/>
+              </w:rPr>
+              <w:t>Возможна Специализация отдельных рабочих мест повторяющихся технологических процессов.</w:t>
+            </w:r>
+          </w:p>
+          <w:p>
+            <w:pPr>
+              <w:tabs>
+                <w:tab w:val="left" w:pos="2160"/>
+                <w:tab w:val="left" w:pos="3825"/>
+              </w:tabs>
+              <w:rPr>
+                <w:rFonts w:ascii="Times New Roman" w:hAnsi="Times New Roman" w:cs="Times New Roman"/>
+                <w:sz w:val="22"/>
+              </w:rPr>
+            </w:pPr>
+          </w:p>
+          <w:p>
+            <w:pPr>
+              <w:tabs>
+                <w:tab w:val="left" w:pos="2160"/>
+                <w:tab w:val="left" w:pos="3825"/>
+              </w:tabs>
+              <w:rPr>
+                <w:rFonts w:ascii="Times New Roman" w:hAnsi="Times New Roman" w:cs="Times New Roman"/>
+                <w:sz w:val="22"/>
+              </w:rPr>
+            </w:pPr>
+            <w:r>
+              <w:rPr>
+                <w:rFonts w:ascii="Times New Roman" w:hAnsi="Times New Roman" w:cs="Times New Roman"/>
+                <w:sz w:val="22"/>
+              </w:rPr>
+              <w:t>Растет эффективность использования оборудования и других элементов производственных фондов.</w:t>
+            </w:r>
+          </w:p>
+        </w:tc>
+        <w:tc>
+          <w:tcPr>
+            <w:tcW w:w="3115" w:type="dxa"/>
+          </w:tcPr>
+          <w:p>
+            <w:pPr>
+              <w:tabs>
+                <w:tab w:val="left" w:pos="2160"/>
+                <w:tab w:val="left" w:pos="3825"/>
+              </w:tabs>
+              <w:rPr>
+                <w:rFonts w:ascii="Times New Roman" w:hAnsi="Times New Roman" w:cs="Times New Roman"/>
+                <w:sz w:val="22"/>
+              </w:rPr>
+            </w:pPr>
+            <w:r>
+              <w:rPr>
+                <w:rFonts w:ascii="Times New Roman" w:hAnsi="Times New Roman" w:cs="Times New Roman"/>
+                <w:sz w:val="22"/>
+              </w:rPr>
+              <w:t>Узкая специализация, неизменная и ограниченная номенклатура изготавливаемых изделий в течение длительного периода времени.</w:t>
+            </w:r>
+          </w:p>
+          <w:p>
+            <w:pPr>
+              <w:tabs>
+                <w:tab w:val="left" w:pos="2160"/>
+                <w:tab w:val="left" w:pos="3825"/>
+              </w:tabs>
+              <w:rPr>
+                <w:rFonts w:ascii="Times New Roman" w:hAnsi="Times New Roman" w:cs="Times New Roman"/>
+                <w:sz w:val="22"/>
+              </w:rPr>
+            </w:pPr>
+          </w:p>
+          <w:p>
+            <w:pPr>
+              <w:tabs>
+                <w:tab w:val="left" w:pos="2160"/>
+                <w:tab w:val="left" w:pos="3825"/>
+              </w:tabs>
+              <w:rPr>
+                <w:rFonts w:ascii="Times New Roman" w:hAnsi="Times New Roman" w:cs="Times New Roman"/>
+                <w:sz w:val="22"/>
+              </w:rPr>
+            </w:pPr>
+            <w:r>
+              <w:rPr>
+                <w:rFonts w:ascii="Times New Roman" w:hAnsi="Times New Roman" w:cs="Times New Roman"/>
+                <w:sz w:val="22"/>
+              </w:rPr>
+              <w:t>Специализация рабочих мест на выполнении определенной операции создает предпосылки для механизации и автоматизации процессов.</w:t>
+            </w:r>
+          </w:p>
+          <w:p>
+            <w:pPr>
+              <w:tabs>
+                <w:tab w:val="left" w:pos="2160"/>
+                <w:tab w:val="left" w:pos="3825"/>
+              </w:tabs>
+              <w:rPr>
+                <w:rFonts w:ascii="Times New Roman" w:hAnsi="Times New Roman" w:cs="Times New Roman"/>
+                <w:sz w:val="22"/>
+              </w:rPr>
+            </w:pPr>
+          </w:p>
+          <w:p>
+            <w:pPr>
+              <w:tabs>
+                <w:tab w:val="left" w:pos="2160"/>
+                <w:tab w:val="left" w:pos="3825"/>
+              </w:tabs>
+              <w:rPr>
+                <w:rFonts w:ascii="Times New Roman" w:hAnsi="Times New Roman" w:cs="Times New Roman"/>
+                <w:sz w:val="22"/>
+              </w:rPr>
+            </w:pPr>
+            <w:r>
+              <w:rPr>
+                <w:rFonts w:ascii="Times New Roman" w:hAnsi="Times New Roman" w:cs="Times New Roman"/>
+                <w:sz w:val="22"/>
+              </w:rPr>
+              <w:t>Себестоимость продукции</w:t>
+            </w:r>
+          </w:p>
+          <w:p>
+            <w:pPr>
+              <w:tabs>
+                <w:tab w:val="left" w:pos="2160"/>
+                <w:tab w:val="left" w:pos="3825"/>
+              </w:tabs>
+              <w:rPr>
+                <w:rFonts w:ascii="Times New Roman" w:hAnsi="Times New Roman" w:cs="Times New Roman"/>
+                <w:sz w:val="22"/>
+              </w:rPr>
+            </w:pPr>
+            <w:r>
+              <w:rPr>
+                <w:rFonts w:ascii="Times New Roman" w:hAnsi="Times New Roman" w:cs="Times New Roman"/>
+                <w:sz w:val="22"/>
+              </w:rPr>
+              <w:t>минимальная по сравнению с единичным и серийным производством.</w:t>
+            </w:r>
+          </w:p>
+        </w:tc>
+      </w:tr>
+    </w:tbl>
+    <w:p>
+      <w:pPr>
+        <w:tabs>
+          <w:tab w:val="left" w:pos="2160"/>
+          <w:tab w:val="left" w:pos="3825"/>
+        </w:tabs>
+        <w:rPr>
+          <w:rFonts w:ascii="Times New Roman" w:hAnsi="Times New Roman" w:cs="Times New Roman"/>
+          <w:sz w:val="22"/>
+        </w:rPr>
+      </w:pPr>
+    </w:p>
+    <w:p>
+      <w:pPr>
+        <w:tabs>
+          <w:tab w:val="left" w:pos="2160"/>
+          <w:tab w:val="left" w:pos="3825"/>
+        </w:tabs>
+        <w:rPr>
+          <w:rFonts w:ascii="Times New Roman" w:hAnsi="Times New Roman" w:cs="Times New Roman"/>
+          <w:b/>
+          <w:sz w:val="22"/>
+        </w:rPr>
+      </w:pPr>
+      <w:r>
+        <w:rPr>
+          <w:rFonts w:ascii="Times New Roman" w:hAnsi="Times New Roman" w:cs="Times New Roman"/>
+          <w:b/>
+          <w:sz w:val="22"/>
+        </w:rPr>
+        <w:t>Производственная структура предприятия</w:t>
+      </w:r>
+    </w:p>
+    <w:p>
+      <w:pPr>
+        <w:tabs>
+          <w:tab w:val="left" w:pos="2160"/>
+          <w:tab w:val="left" w:pos="3825"/>
+        </w:tabs>
+        <w:rPr>
+          <w:rFonts w:ascii="Times New Roman" w:hAnsi="Times New Roman" w:cs="Times New Roman"/>
+          <w:sz w:val="22"/>
+        </w:rPr>
+      </w:pPr>
+      <w:r>
+        <w:rPr>
+          <w:rFonts w:ascii="Times New Roman" w:hAnsi="Times New Roman" w:cs="Times New Roman"/>
+          <w:sz w:val="22"/>
+        </w:rPr>
+        <w:t xml:space="preserve">Под производственной структурой предприятия понимается </w:t>
+      </w:r>
+      <w:r>
+        <w:rPr>
+          <w:rFonts w:ascii="Times New Roman" w:hAnsi="Times New Roman" w:cs="Times New Roman"/>
+          <w:sz w:val="22"/>
+        </w:rPr>
+        <w:t>состав образующих его участков, цехов и служб, формы их взаимосвязи в процессе производства продукции.</w:t>
+      </w:r>
+    </w:p>
+    <w:p>
+      <w:pPr>
+        <w:tabs>
+          <w:tab w:val="left" w:pos="2160"/>
+          <w:tab w:val="left" w:pos="3825"/>
+        </w:tabs>
+        <w:rPr>
+          <w:rFonts w:ascii="Times New Roman" w:hAnsi="Times New Roman" w:cs="Times New Roman"/>
+          <w:sz w:val="22"/>
+        </w:rPr>
+      </w:pPr>
+      <w:r>
+        <w:rPr>
+          <w:rFonts w:ascii="Times New Roman" w:hAnsi="Times New Roman" w:cs="Times New Roman"/>
+          <w:sz w:val="22"/>
+        </w:rPr>
+        <w:lastRenderedPageBreak/>
+        <w:t>Главными элементами производственной структуры предприятия считаются рабочие места, участки, цеха.</w:t>
+      </w:r>
+    </w:p>
+    <w:p>
+      <w:pPr>
+        <w:tabs>
+          <w:tab w:val="left" w:pos="2160"/>
+          <w:tab w:val="left" w:pos="3825"/>
+        </w:tabs>
+        <w:rPr>
+          <w:rFonts w:ascii="Times New Roman" w:hAnsi="Times New Roman" w:cs="Times New Roman"/>
+          <w:sz w:val="22"/>
+        </w:rPr>
+      </w:pPr>
+      <w:r>
+        <w:rPr>
+          <w:rFonts w:ascii="Times New Roman" w:hAnsi="Times New Roman" w:cs="Times New Roman"/>
+          <w:sz w:val="22"/>
+        </w:rPr>
+        <w:t xml:space="preserve">Рабочим местом называется неделимое в организационном отношении звено производственного процесса, обслуживаемое одним или несколькими рабочими, предназначенное для выполнения определенной производственной или обслуживающей операции и оснащенное соответствующим оборудованием. </w:t>
+      </w:r>
+    </w:p>
+    <w:p>
+      <w:pPr>
+        <w:tabs>
+          <w:tab w:val="left" w:pos="2160"/>
+          <w:tab w:val="left" w:pos="3825"/>
+        </w:tabs>
+        <w:rPr>
+          <w:rFonts w:ascii="Times New Roman" w:hAnsi="Times New Roman" w:cs="Times New Roman"/>
+          <w:sz w:val="22"/>
+        </w:rPr>
+      </w:pPr>
+      <w:r>
+        <w:rPr>
+          <w:rFonts w:ascii="Times New Roman" w:hAnsi="Times New Roman" w:cs="Times New Roman"/>
+          <w:sz w:val="22"/>
+        </w:rPr>
+        <w:t xml:space="preserve">- Стационарное рабочее место расположено на закрепленной производственной площади </w:t>
+      </w:r>
+    </w:p>
+    <w:p>
+      <w:pPr>
+        <w:tabs>
+          <w:tab w:val="left" w:pos="2160"/>
+          <w:tab w:val="left" w:pos="3825"/>
+        </w:tabs>
+        <w:rPr>
+          <w:rFonts w:ascii="Times New Roman" w:hAnsi="Times New Roman" w:cs="Times New Roman"/>
+          <w:sz w:val="22"/>
+        </w:rPr>
+      </w:pPr>
+      <w:r>
+        <w:rPr>
+          <w:rFonts w:ascii="Times New Roman" w:hAnsi="Times New Roman" w:cs="Times New Roman"/>
+          <w:sz w:val="22"/>
+        </w:rPr>
+        <w:t xml:space="preserve">- Подвижное рабочее место передвигается с </w:t>
+      </w:r>
+      <w:proofErr w:type="spellStart"/>
+      <w:r>
+        <w:rPr>
+          <w:rFonts w:ascii="Times New Roman" w:hAnsi="Times New Roman" w:cs="Times New Roman"/>
+          <w:sz w:val="22"/>
+        </w:rPr>
+        <w:t>соответвующим</w:t>
+      </w:r>
+      <w:proofErr w:type="spellEnd"/>
+      <w:r>
+        <w:rPr>
+          <w:rFonts w:ascii="Times New Roman" w:hAnsi="Times New Roman" w:cs="Times New Roman"/>
+          <w:sz w:val="22"/>
+        </w:rPr>
+        <w:t xml:space="preserve"> </w:t>
+      </w:r>
+      <w:proofErr w:type="spellStart"/>
+      <w:r>
+        <w:rPr>
+          <w:rFonts w:ascii="Times New Roman" w:hAnsi="Times New Roman" w:cs="Times New Roman"/>
+          <w:sz w:val="22"/>
+        </w:rPr>
+        <w:t>оборудванием</w:t>
+      </w:r>
+      <w:proofErr w:type="spellEnd"/>
+      <w:r>
+        <w:rPr>
+          <w:rFonts w:ascii="Times New Roman" w:hAnsi="Times New Roman" w:cs="Times New Roman"/>
+          <w:sz w:val="22"/>
+        </w:rPr>
+        <w:t xml:space="preserve"> по мере обработки предметов труда.</w:t>
+      </w:r>
+    </w:p>
+    <w:p>
+      <w:pPr>
+        <w:tabs>
+          <w:tab w:val="left" w:pos="2160"/>
+          <w:tab w:val="left" w:pos="3825"/>
+        </w:tabs>
+        <w:rPr>
+          <w:rFonts w:ascii="Times New Roman" w:hAnsi="Times New Roman" w:cs="Times New Roman"/>
+          <w:sz w:val="22"/>
+        </w:rPr>
+      </w:pPr>
+      <w:r>
+        <w:rPr>
+          <w:rFonts w:ascii="Times New Roman" w:hAnsi="Times New Roman" w:cs="Times New Roman"/>
+          <w:sz w:val="22"/>
+        </w:rPr>
+        <w:t xml:space="preserve">Участок – производственное подразделение, объединяющее ряд рабочих мест, сгруппированных по определенным признакам, осуществляющее часть общего производственного процесса по изготовлению продукции или обслуживанию процесса производства. </w:t>
+      </w:r>
+      <w:r>
+        <w:rPr>
+          <w:rFonts w:ascii="Times New Roman" w:hAnsi="Times New Roman" w:cs="Times New Roman"/>
+          <w:sz w:val="22"/>
+        </w:rPr>
+        <w:cr/>
+        <w:t xml:space="preserve">На производственном участке помимо основных и вспомогательных рабочих имеется руководитель (мастер участка). </w:t>
+      </w:r>
+      <w:r>
+        <w:rPr>
+          <w:rFonts w:ascii="Times New Roman" w:hAnsi="Times New Roman" w:cs="Times New Roman"/>
+          <w:sz w:val="22"/>
+        </w:rPr>
+        <w:cr/>
+        <w:t>Участки связаны между собой постоянными технологическими связями и объединяются в цеха.</w:t>
+      </w:r>
+    </w:p>
+    <w:p>
+      <w:pPr>
+        <w:tabs>
+          <w:tab w:val="left" w:pos="2160"/>
+          <w:tab w:val="left" w:pos="3825"/>
+        </w:tabs>
+        <w:rPr>
+          <w:rFonts w:ascii="Times New Roman" w:hAnsi="Times New Roman" w:cs="Times New Roman"/>
+          <w:sz w:val="22"/>
+        </w:rPr>
+      </w:pPr>
+      <w:r>
+        <w:rPr>
+          <w:rFonts w:ascii="Times New Roman" w:hAnsi="Times New Roman" w:cs="Times New Roman"/>
+          <w:sz w:val="22"/>
+        </w:rPr>
+        <w:t xml:space="preserve">Цех – наиболее сложная система, входящая в производственную структуру, в которую входят в качестве подсистем производственные участки и ряд функциональных органов. </w:t>
+      </w:r>
+      <w:r>
+        <w:rPr>
+          <w:rFonts w:ascii="Times New Roman" w:hAnsi="Times New Roman" w:cs="Times New Roman"/>
+          <w:sz w:val="22"/>
+        </w:rPr>
+        <w:cr/>
+        <w:t>В цехах возникают сложные взаимосвязи, они характеризуются достаточно сложной структурой и организацией с развитыми внутренними и внешними взаимосвязями.</w:t>
+      </w:r>
+    </w:p>
+    <w:p>
+      <w:pPr>
+        <w:tabs>
+          <w:tab w:val="left" w:pos="2160"/>
+          <w:tab w:val="left" w:pos="3825"/>
+        </w:tabs>
+        <w:rPr>
+          <w:rFonts w:ascii="Times New Roman" w:hAnsi="Times New Roman" w:cs="Times New Roman"/>
+          <w:sz w:val="22"/>
+        </w:rPr>
+      </w:pPr>
+      <w:r>
+        <w:rPr>
+          <w:rFonts w:ascii="Times New Roman" w:hAnsi="Times New Roman" w:cs="Times New Roman"/>
+          <w:sz w:val="22"/>
+        </w:rPr>
+        <w:t>Организационная структура гостиничного предприятия — это функционально-технологическая система, обеспечивающая его деятельность.</w:t>
+      </w:r>
+    </w:p>
+    <w:p>
+      <w:pPr>
+        <w:tabs>
+          <w:tab w:val="left" w:pos="2160"/>
+          <w:tab w:val="left" w:pos="3825"/>
+        </w:tabs>
+        <w:rPr>
+          <w:rFonts w:ascii="Times New Roman" w:hAnsi="Times New Roman" w:cs="Times New Roman"/>
+          <w:sz w:val="22"/>
+        </w:rPr>
+      </w:pPr>
+    </w:p>
+    <w:p>
+      <w:pPr>
+        <w:tabs>
+          <w:tab w:val="left" w:pos="2160"/>
+          <w:tab w:val="left" w:pos="3825"/>
+        </w:tabs>
+        <w:rPr>
+          <w:rFonts w:ascii="Times New Roman" w:hAnsi="Times New Roman" w:cs="Times New Roman"/>
+          <w:sz w:val="22"/>
+        </w:rPr>
+      </w:pPr>
+    </w:p>
+    <w:p>
+      <w:pPr>
+        <w:tabs>
+          <w:tab w:val="left" w:pos="2160"/>
+          <w:tab w:val="left" w:pos="3825"/>
+        </w:tabs>
+        <w:rPr>
+          <w:rFonts w:ascii="Times New Roman" w:hAnsi="Times New Roman" w:cs="Times New Roman"/>
+          <w:sz w:val="22"/>
+        </w:rPr>
+      </w:pPr>
+      <w:r>
+        <w:rPr>
+          <w:rFonts w:ascii="Times New Roman" w:hAnsi="Times New Roman" w:cs="Times New Roman"/>
+          <w:sz w:val="22"/>
+        </w:rPr>
+        <w:t>Основные функциональные подразделения и система менеджмента:</w:t>
+      </w:r>
+    </w:p>
+    <w:p>
+      <w:pPr>
+        <w:pStyle w:val="a3"/>
+        <w:numPr>
+          <w:ilvl w:val="0"/>
+          <w:numId w:val="40"/>
+        </w:numPr>
+        <w:tabs>
+          <w:tab w:val="left" w:pos="2160"/>
+          <w:tab w:val="left" w:pos="3825"/>
+        </w:tabs>
+        <w:rPr>
+          <w:rFonts w:ascii="Times New Roman" w:hAnsi="Times New Roman" w:cs="Times New Roman"/>
+          <w:sz w:val="22"/>
+        </w:rPr>
+      </w:pPr>
+      <w:r>
+        <w:rPr>
+          <w:rFonts w:ascii="Times New Roman" w:hAnsi="Times New Roman" w:cs="Times New Roman"/>
+          <w:sz w:val="22"/>
+        </w:rPr>
+        <w:t xml:space="preserve">Руководители высшего звена и управляющий персонал </w:t>
+      </w:r>
+    </w:p>
+    <w:p>
+      <w:pPr>
+        <w:pStyle w:val="a3"/>
+        <w:numPr>
+          <w:ilvl w:val="0"/>
+          <w:numId w:val="40"/>
+        </w:numPr>
+        <w:tabs>
+          <w:tab w:val="left" w:pos="2160"/>
+          <w:tab w:val="left" w:pos="3825"/>
+        </w:tabs>
+        <w:rPr>
+          <w:rFonts w:ascii="Times New Roman" w:hAnsi="Times New Roman" w:cs="Times New Roman"/>
+          <w:sz w:val="22"/>
+        </w:rPr>
+      </w:pPr>
+      <w:r>
+        <w:rPr>
+          <w:rFonts w:ascii="Times New Roman" w:hAnsi="Times New Roman" w:cs="Times New Roman"/>
+          <w:sz w:val="22"/>
+        </w:rPr>
+        <w:t xml:space="preserve">Служба приема и размещения гостей – дежурные администраторы, кассир, портье </w:t>
+      </w:r>
+    </w:p>
+    <w:p>
+      <w:pPr>
+        <w:pStyle w:val="a3"/>
+        <w:numPr>
+          <w:ilvl w:val="0"/>
+          <w:numId w:val="40"/>
+        </w:numPr>
+        <w:tabs>
+          <w:tab w:val="left" w:pos="2160"/>
+          <w:tab w:val="left" w:pos="3825"/>
+        </w:tabs>
+        <w:rPr>
+          <w:rFonts w:ascii="Times New Roman" w:hAnsi="Times New Roman" w:cs="Times New Roman"/>
+          <w:sz w:val="22"/>
+        </w:rPr>
+      </w:pPr>
+      <w:r>
+        <w:rPr>
+          <w:rFonts w:ascii="Times New Roman" w:hAnsi="Times New Roman" w:cs="Times New Roman"/>
+          <w:sz w:val="22"/>
+        </w:rPr>
+        <w:t xml:space="preserve">Служба обслуживания гостей – носильщики, швейцары, курьеры, </w:t>
+      </w:r>
+      <w:proofErr w:type="spellStart"/>
+      <w:r>
+        <w:rPr>
+          <w:rFonts w:ascii="Times New Roman" w:hAnsi="Times New Roman" w:cs="Times New Roman"/>
+          <w:sz w:val="22"/>
+        </w:rPr>
+        <w:t>парковщики</w:t>
+      </w:r>
+      <w:proofErr w:type="spellEnd"/>
+    </w:p>
+    <w:p>
+      <w:pPr>
+        <w:pStyle w:val="a3"/>
+        <w:numPr>
+          <w:ilvl w:val="0"/>
+          <w:numId w:val="40"/>
+        </w:numPr>
+        <w:tabs>
+          <w:tab w:val="left" w:pos="2160"/>
+          <w:tab w:val="left" w:pos="3825"/>
+        </w:tabs>
+        <w:rPr>
+          <w:rFonts w:ascii="Times New Roman" w:hAnsi="Times New Roman" w:cs="Times New Roman"/>
+          <w:sz w:val="22"/>
+        </w:rPr>
+      </w:pPr>
+      <w:r>
+        <w:rPr>
+          <w:rFonts w:ascii="Times New Roman" w:hAnsi="Times New Roman" w:cs="Times New Roman"/>
+          <w:sz w:val="22"/>
+        </w:rPr>
+        <w:t xml:space="preserve">Хоз. Служба – горничные, прачечная, уборщики территории и </w:t>
+      </w:r>
+      <w:proofErr w:type="spellStart"/>
+      <w:r>
+        <w:rPr>
+          <w:rFonts w:ascii="Times New Roman" w:hAnsi="Times New Roman" w:cs="Times New Roman"/>
+          <w:sz w:val="22"/>
+        </w:rPr>
+        <w:t>общетсвенных</w:t>
+      </w:r>
+      <w:proofErr w:type="spellEnd"/>
+      <w:r>
+        <w:rPr>
+          <w:rFonts w:ascii="Times New Roman" w:hAnsi="Times New Roman" w:cs="Times New Roman"/>
+          <w:sz w:val="22"/>
+        </w:rPr>
+        <w:t xml:space="preserve"> мест.</w:t>
+      </w:r>
+    </w:p>
+    <w:p>
+      <w:pPr>
+        <w:pStyle w:val="a3"/>
+        <w:numPr>
+          <w:ilvl w:val="0"/>
+          <w:numId w:val="40"/>
+        </w:numPr>
+        <w:tabs>
+          <w:tab w:val="left" w:pos="2160"/>
+          <w:tab w:val="left" w:pos="3825"/>
+        </w:tabs>
+        <w:rPr>
+          <w:rFonts w:ascii="Times New Roman" w:hAnsi="Times New Roman" w:cs="Times New Roman"/>
+          <w:sz w:val="22"/>
+        </w:rPr>
+      </w:pPr>
+      <w:r>
+        <w:rPr>
+          <w:rFonts w:ascii="Times New Roman" w:hAnsi="Times New Roman" w:cs="Times New Roman"/>
+          <w:sz w:val="22"/>
+        </w:rPr>
+        <w:t>Служба питания – шеф повар, повара, бармены, официанты, стюарды на кухне</w:t>
+      </w:r>
+    </w:p>
+    <w:p>
+      <w:pPr>
+        <w:pStyle w:val="a3"/>
+        <w:numPr>
+          <w:ilvl w:val="0"/>
+          <w:numId w:val="40"/>
+        </w:numPr>
+        <w:tabs>
+          <w:tab w:val="left" w:pos="2160"/>
+          <w:tab w:val="left" w:pos="3825"/>
+        </w:tabs>
+        <w:rPr>
+          <w:rFonts w:ascii="Times New Roman" w:hAnsi="Times New Roman" w:cs="Times New Roman"/>
+          <w:sz w:val="22"/>
+        </w:rPr>
+      </w:pPr>
+      <w:r>
+        <w:rPr>
+          <w:rFonts w:ascii="Times New Roman" w:hAnsi="Times New Roman" w:cs="Times New Roman"/>
+          <w:sz w:val="22"/>
+        </w:rPr>
+        <w:t>Служба безопасности – охранники</w:t>
+      </w:r>
+    </w:p>
+    <w:p>
+      <w:pPr>
+        <w:pStyle w:val="a3"/>
+        <w:numPr>
+          <w:ilvl w:val="0"/>
+          <w:numId w:val="40"/>
+        </w:numPr>
+        <w:tabs>
+          <w:tab w:val="left" w:pos="2160"/>
+          <w:tab w:val="left" w:pos="3825"/>
+        </w:tabs>
+        <w:rPr>
+          <w:rFonts w:ascii="Times New Roman" w:hAnsi="Times New Roman" w:cs="Times New Roman"/>
+          <w:sz w:val="22"/>
+        </w:rPr>
+      </w:pPr>
+      <w:r>
+        <w:rPr>
+          <w:rFonts w:ascii="Times New Roman" w:hAnsi="Times New Roman" w:cs="Times New Roman"/>
+          <w:sz w:val="22"/>
+        </w:rPr>
+        <w:t xml:space="preserve">Инженерная служба – электрики, сантехники, </w:t>
+      </w:r>
+      <w:proofErr w:type="spellStart"/>
+      <w:r>
+        <w:rPr>
+          <w:rFonts w:ascii="Times New Roman" w:hAnsi="Times New Roman" w:cs="Times New Roman"/>
+          <w:sz w:val="22"/>
+        </w:rPr>
+        <w:t>ремнотники</w:t>
+      </w:r>
+      <w:proofErr w:type="spellEnd"/>
+    </w:p>
+    <w:p>
+      <w:pPr>
+        <w:pStyle w:val="a3"/>
+        <w:numPr>
+          <w:ilvl w:val="0"/>
+          <w:numId w:val="40"/>
+        </w:numPr>
+        <w:tabs>
+          <w:tab w:val="left" w:pos="2160"/>
+          <w:tab w:val="left" w:pos="3825"/>
+        </w:tabs>
+        <w:rPr>
+          <w:rFonts w:ascii="Times New Roman" w:hAnsi="Times New Roman" w:cs="Times New Roman"/>
+          <w:sz w:val="22"/>
+        </w:rPr>
+      </w:pPr>
+      <w:r>
+        <w:rPr>
+          <w:rFonts w:ascii="Times New Roman" w:hAnsi="Times New Roman" w:cs="Times New Roman"/>
+          <w:sz w:val="22"/>
+        </w:rPr>
+        <w:t>Закупок – Административно-хозяйственные отделы или снабженцы</w:t>
+      </w:r>
+    </w:p>
+    <w:p>
+      <w:pPr>
+        <w:pStyle w:val="a3"/>
+        <w:numPr>
+          <w:ilvl w:val="0"/>
+          <w:numId w:val="40"/>
+        </w:numPr>
+        <w:tabs>
+          <w:tab w:val="left" w:pos="2160"/>
+          <w:tab w:val="left" w:pos="3825"/>
+        </w:tabs>
+        <w:rPr>
+          <w:rFonts w:ascii="Times New Roman" w:hAnsi="Times New Roman" w:cs="Times New Roman"/>
+          <w:sz w:val="22"/>
+        </w:rPr>
+      </w:pPr>
+      <w:r>
+        <w:rPr>
+          <w:rFonts w:ascii="Times New Roman" w:hAnsi="Times New Roman" w:cs="Times New Roman"/>
+          <w:sz w:val="22"/>
+        </w:rPr>
+        <w:t xml:space="preserve">Кадровая и финансовая службы – </w:t>
+      </w:r>
+      <w:r>
+        <w:rPr>
+          <w:rFonts w:ascii="Times New Roman" w:hAnsi="Times New Roman" w:cs="Times New Roman"/>
+          <w:sz w:val="22"/>
+          <w:lang w:val="en-US"/>
+        </w:rPr>
+        <w:t>HR</w:t>
+      </w:r>
+      <w:r>
+        <w:rPr>
+          <w:rFonts w:ascii="Times New Roman" w:hAnsi="Times New Roman" w:cs="Times New Roman"/>
+          <w:sz w:val="22"/>
+        </w:rPr>
+        <w:t xml:space="preserve"> –</w:t>
+      </w:r>
+      <w:r>
+        <w:rPr>
+          <w:rFonts w:ascii="Times New Roman" w:hAnsi="Times New Roman" w:cs="Times New Roman"/>
+          <w:sz w:val="22"/>
+        </w:rPr>
+        <w:t xml:space="preserve"> </w:t>
+      </w:r>
+      <w:proofErr w:type="gramStart"/>
+      <w:r>
+        <w:rPr>
+          <w:rFonts w:ascii="Times New Roman" w:hAnsi="Times New Roman" w:cs="Times New Roman"/>
+          <w:sz w:val="22"/>
+        </w:rPr>
+        <w:t>менеджеры ,</w:t>
+      </w:r>
+      <w:proofErr w:type="gramEnd"/>
+      <w:r>
+        <w:rPr>
+          <w:rFonts w:ascii="Times New Roman" w:hAnsi="Times New Roman" w:cs="Times New Roman"/>
+          <w:sz w:val="22"/>
+        </w:rPr>
+        <w:t xml:space="preserve"> Бухгалтер</w:t>
+      </w:r>
+      <w:r>
+        <w:rPr>
+          <w:rFonts w:ascii="Times New Roman" w:hAnsi="Times New Roman" w:cs="Times New Roman"/>
+          <w:sz w:val="22"/>
+        </w:rPr>
+        <w:t xml:space="preserve"> </w:t>
+      </w:r>
+    </w:p>
+    <w:p>
+      <w:pPr>
+        <w:tabs>
+          <w:tab w:val="left" w:pos="2160"/>
+          <w:tab w:val="left" w:pos="3825"/>
+        </w:tabs>
+        <w:ind w:left="360"/>
+        <w:rPr>
+          <w:rFonts w:ascii="Times New Roman" w:hAnsi="Times New Roman" w:cs="Times New Roman"/>
+          <w:sz w:val="22"/>
+        </w:rPr>
+      </w:pPr>
+      <w:r>
+        <w:rPr>
+          <w:rFonts w:ascii="Times New Roman" w:hAnsi="Times New Roman" w:cs="Times New Roman"/>
+          <w:sz w:val="22"/>
+        </w:rPr>
+        <w:t xml:space="preserve">Организационная структура управления организации – это общность подразделений, отделов, служб в управлении, их объединение, условия подчиненности органу управления, набор информационных отношений, распределение функций по уровням и структурам. </w:t>
+      </w:r>
+    </w:p>
+    <w:p>
+      <w:pPr>
+        <w:tabs>
+          <w:tab w:val="left" w:pos="2160"/>
+          <w:tab w:val="left" w:pos="3825"/>
+        </w:tabs>
+        <w:ind w:left="360"/>
+        <w:rPr>
+          <w:rFonts w:ascii="Times New Roman" w:hAnsi="Times New Roman" w:cs="Times New Roman"/>
+          <w:b/>
+          <w:sz w:val="22"/>
+        </w:rPr>
+      </w:pPr>
+      <w:r>
+        <w:rPr>
+          <w:rFonts w:ascii="Times New Roman" w:hAnsi="Times New Roman" w:cs="Times New Roman"/>
+          <w:b/>
+          <w:sz w:val="22"/>
+        </w:rPr>
+        <w:t>Требования к организационной структуре управления</w:t>
+      </w:r>
+    </w:p>
+    <w:p>
+      <w:pPr>
+        <w:tabs>
+          <w:tab w:val="left" w:pos="2160"/>
+          <w:tab w:val="left" w:pos="3825"/>
+        </w:tabs>
+        <w:ind w:left="360"/>
+        <w:rPr>
+          <w:rFonts w:ascii="Times New Roman" w:hAnsi="Times New Roman" w:cs="Times New Roman"/>
+          <w:sz w:val="22"/>
+        </w:rPr>
+      </w:pPr>
+      <w:r>
+        <w:rPr>
+          <w:rFonts w:ascii="Times New Roman" w:hAnsi="Times New Roman" w:cs="Times New Roman"/>
+          <w:sz w:val="22"/>
+        </w:rPr>
+        <w:t>Адаптивность</w:t>
+      </w:r>
+      <w:r>
+        <w:rPr>
+          <w:rFonts w:ascii="Times New Roman" w:hAnsi="Times New Roman" w:cs="Times New Roman"/>
+          <w:sz w:val="22"/>
+        </w:rPr>
+        <w:t xml:space="preserve"> – способность приспосабливаться к переменам во внешней среде </w:t>
+      </w:r>
+    </w:p>
+    <w:p>
+      <w:pPr>
+        <w:tabs>
+          <w:tab w:val="left" w:pos="2160"/>
+          <w:tab w:val="left" w:pos="3825"/>
+        </w:tabs>
+        <w:ind w:left="360"/>
+        <w:rPr>
+          <w:rFonts w:ascii="Times New Roman" w:hAnsi="Times New Roman" w:cs="Times New Roman"/>
+          <w:sz w:val="22"/>
+        </w:rPr>
+      </w:pPr>
+      <w:r>
+        <w:rPr>
+          <w:rFonts w:ascii="Times New Roman" w:hAnsi="Times New Roman" w:cs="Times New Roman"/>
+          <w:sz w:val="22"/>
+        </w:rPr>
+        <w:lastRenderedPageBreak/>
+        <w:t>Динамизм, гибкость – способность чутко реагировать на изменение спроса, технологий</w:t>
+      </w:r>
+    </w:p>
+    <w:p>
+      <w:pPr>
+        <w:tabs>
+          <w:tab w:val="left" w:pos="2160"/>
+          <w:tab w:val="left" w:pos="3825"/>
+        </w:tabs>
+        <w:ind w:left="360"/>
+        <w:rPr>
+          <w:rFonts w:ascii="Times New Roman" w:hAnsi="Times New Roman" w:cs="Times New Roman"/>
+          <w:sz w:val="22"/>
+        </w:rPr>
+      </w:pPr>
+      <w:r>
+        <w:rPr>
+          <w:rFonts w:ascii="Times New Roman" w:hAnsi="Times New Roman" w:cs="Times New Roman"/>
+          <w:sz w:val="22"/>
+        </w:rPr>
+        <w:t>Адекватность – Постоянное соответствие орг. Структуры параметрам управляемой системы.</w:t>
+      </w:r>
+    </w:p>
+    <w:p>
+      <w:pPr>
+        <w:tabs>
+          <w:tab w:val="left" w:pos="2160"/>
+          <w:tab w:val="left" w:pos="3825"/>
+        </w:tabs>
+        <w:ind w:left="360"/>
+        <w:rPr>
+          <w:rFonts w:ascii="Times New Roman" w:hAnsi="Times New Roman" w:cs="Times New Roman"/>
+          <w:sz w:val="22"/>
+        </w:rPr>
+      </w:pPr>
+      <w:r>
+        <w:rPr>
+          <w:rFonts w:ascii="Times New Roman" w:hAnsi="Times New Roman" w:cs="Times New Roman"/>
+          <w:sz w:val="22"/>
+        </w:rPr>
+        <w:t>Специализация – ограничение и конкретизация сферы деятельности каждого управленческого звена</w:t>
+      </w:r>
+    </w:p>
+    <w:p>
+      <w:pPr>
+        <w:tabs>
+          <w:tab w:val="left" w:pos="2160"/>
+          <w:tab w:val="left" w:pos="3825"/>
+        </w:tabs>
+        <w:ind w:left="360"/>
+        <w:rPr>
+          <w:rFonts w:ascii="Times New Roman" w:hAnsi="Times New Roman" w:cs="Times New Roman"/>
+          <w:sz w:val="22"/>
+        </w:rPr>
+      </w:pPr>
+      <w:r>
+        <w:rPr>
+          <w:rFonts w:ascii="Times New Roman" w:hAnsi="Times New Roman" w:cs="Times New Roman"/>
+          <w:sz w:val="22"/>
+        </w:rPr>
+        <w:t>Оптимальность – Установление рациональных связей между уровнями и звеньями управлениями</w:t>
+      </w:r>
+    </w:p>
+    <w:p>
+      <w:pPr>
+        <w:tabs>
+          <w:tab w:val="left" w:pos="2160"/>
+          <w:tab w:val="left" w:pos="3825"/>
+        </w:tabs>
+        <w:ind w:left="360"/>
+        <w:rPr>
+          <w:rFonts w:ascii="Times New Roman" w:hAnsi="Times New Roman" w:cs="Times New Roman"/>
+          <w:sz w:val="22"/>
+        </w:rPr>
+      </w:pPr>
+      <w:r>
+        <w:rPr>
+          <w:rFonts w:ascii="Times New Roman" w:hAnsi="Times New Roman" w:cs="Times New Roman"/>
+          <w:sz w:val="22"/>
+        </w:rPr>
+        <w:t>Оперативность – Недопущение необратимых изменений в управляемой системе за время принятия решения</w:t>
+      </w:r>
+    </w:p>
+    <w:p>
+      <w:pPr>
+        <w:tabs>
+          <w:tab w:val="left" w:pos="2160"/>
+          <w:tab w:val="left" w:pos="3825"/>
+        </w:tabs>
+        <w:ind w:left="360"/>
+        <w:rPr>
+          <w:rFonts w:ascii="Times New Roman" w:hAnsi="Times New Roman" w:cs="Times New Roman"/>
+          <w:sz w:val="22"/>
+        </w:rPr>
+      </w:pPr>
+      <w:r>
+        <w:rPr>
+          <w:rFonts w:ascii="Times New Roman" w:hAnsi="Times New Roman" w:cs="Times New Roman"/>
+          <w:sz w:val="22"/>
+        </w:rPr>
+        <w:t>Надежность – гарантия достоверности передачи информации</w:t>
+      </w:r>
+    </w:p>
+    <w:p>
+      <w:pPr>
+        <w:tabs>
+          <w:tab w:val="left" w:pos="2160"/>
+          <w:tab w:val="left" w:pos="3825"/>
+        </w:tabs>
+        <w:ind w:left="360"/>
+        <w:rPr>
+          <w:rFonts w:ascii="Times New Roman" w:hAnsi="Times New Roman" w:cs="Times New Roman"/>
+          <w:sz w:val="22"/>
+        </w:rPr>
+      </w:pPr>
+      <w:r>
+        <w:rPr>
+          <w:rFonts w:ascii="Times New Roman" w:hAnsi="Times New Roman" w:cs="Times New Roman"/>
+          <w:sz w:val="22"/>
+        </w:rPr>
+        <w:t xml:space="preserve">Экономичность – соответствие затрат на содержание органов управления возможности </w:t>
+      </w:r>
+      <w:proofErr w:type="spellStart"/>
+      <w:r>
+        <w:rPr>
+          <w:rFonts w:ascii="Times New Roman" w:hAnsi="Times New Roman" w:cs="Times New Roman"/>
+          <w:sz w:val="22"/>
+        </w:rPr>
+        <w:t>органзации</w:t>
+      </w:r>
+      <w:proofErr w:type="spellEnd"/>
+    </w:p>
+    <w:p>
+      <w:pPr>
+        <w:tabs>
+          <w:tab w:val="left" w:pos="2160"/>
+          <w:tab w:val="left" w:pos="3825"/>
+        </w:tabs>
+        <w:ind w:left="360"/>
+        <w:rPr>
+          <w:rFonts w:ascii="Times New Roman" w:hAnsi="Times New Roman" w:cs="Times New Roman"/>
+          <w:sz w:val="22"/>
+        </w:rPr>
+      </w:pPr>
+      <w:r>
+        <w:rPr>
+          <w:rFonts w:ascii="Times New Roman" w:hAnsi="Times New Roman" w:cs="Times New Roman"/>
+          <w:sz w:val="22"/>
+        </w:rPr>
+        <w:t xml:space="preserve">Простота – легкость для персонала в приспособлении к данной форме </w:t>
+      </w:r>
+      <w:proofErr w:type="spellStart"/>
+      <w:r>
+        <w:rPr>
+          <w:rFonts w:ascii="Times New Roman" w:hAnsi="Times New Roman" w:cs="Times New Roman"/>
+          <w:sz w:val="22"/>
+        </w:rPr>
+        <w:t>упрвления</w:t>
+      </w:r>
+      <w:proofErr w:type="spellEnd"/>
+      <w:r>
+        <w:rPr>
+          <w:rFonts w:ascii="Times New Roman" w:hAnsi="Times New Roman" w:cs="Times New Roman"/>
+          <w:sz w:val="22"/>
+        </w:rPr>
+        <w:t>.</w:t>
+      </w:r>
+    </w:p>
+    <w:p>
+      <w:pPr>
+        <w:tabs>
+          <w:tab w:val="left" w:pos="2160"/>
+          <w:tab w:val="left" w:pos="3825"/>
+        </w:tabs>
+        <w:ind w:left="360"/>
+        <w:rPr>
+          <w:rFonts w:ascii="Times New Roman" w:hAnsi="Times New Roman" w:cs="Times New Roman"/>
+          <w:sz w:val="22"/>
+        </w:rPr>
+      </w:pPr>
+      <w:r>
+        <w:rPr>
+          <w:rFonts w:ascii="Times New Roman" w:hAnsi="Times New Roman" w:cs="Times New Roman"/>
+          <w:b/>
+          <w:sz w:val="22"/>
+        </w:rPr>
+        <w:t>Технологический процесс в гостинице</w:t>
+      </w:r>
+      <w:r>
+        <w:rPr>
+          <w:rFonts w:ascii="Times New Roman" w:hAnsi="Times New Roman" w:cs="Times New Roman"/>
+          <w:sz w:val="22"/>
+        </w:rPr>
+        <w:t> - это упорядоченная совокупность операций по изменению размеров, формы, качества, внешнего вида или свойства услуги, например, разработка комплекса мероприятий по повышению качества услуги в гостиничном предприятии.</w:t>
+      </w:r>
+    </w:p>
+    <w:p>
+      <w:pPr>
+        <w:tabs>
+          <w:tab w:val="left" w:pos="2160"/>
+          <w:tab w:val="left" w:pos="3825"/>
+        </w:tabs>
+        <w:ind w:left="360"/>
+        <w:rPr>
+          <w:rFonts w:ascii="Times New Roman" w:hAnsi="Times New Roman" w:cs="Times New Roman"/>
+          <w:sz w:val="22"/>
+        </w:rPr>
+      </w:pPr>
+      <w:r>
+        <w:rPr>
+          <w:rFonts w:ascii="Times New Roman" w:hAnsi="Times New Roman" w:cs="Times New Roman"/>
+          <w:sz w:val="22"/>
+        </w:rPr>
+        <w:t>По характеру технологических операций различают:</w:t>
+      </w:r>
+    </w:p>
+    <w:p>
+      <w:pPr>
+        <w:pStyle w:val="a3"/>
+        <w:numPr>
+          <w:ilvl w:val="0"/>
+          <w:numId w:val="41"/>
+        </w:numPr>
+        <w:tabs>
+          <w:tab w:val="left" w:pos="2160"/>
+          <w:tab w:val="left" w:pos="3825"/>
+        </w:tabs>
+        <w:rPr>
+          <w:rFonts w:ascii="Times New Roman" w:hAnsi="Times New Roman" w:cs="Times New Roman"/>
+          <w:sz w:val="22"/>
+        </w:rPr>
+      </w:pPr>
+      <w:r>
+        <w:rPr>
+          <w:rFonts w:ascii="Times New Roman" w:hAnsi="Times New Roman" w:cs="Times New Roman"/>
+          <w:sz w:val="22"/>
+        </w:rPr>
+        <w:t xml:space="preserve">Единичные </w:t>
+      </w:r>
+      <w:proofErr w:type="spellStart"/>
+      <w:r>
+        <w:rPr>
+          <w:rFonts w:ascii="Times New Roman" w:hAnsi="Times New Roman" w:cs="Times New Roman"/>
+          <w:sz w:val="22"/>
+        </w:rPr>
+        <w:t>технологчиеские</w:t>
+      </w:r>
+      <w:proofErr w:type="spellEnd"/>
+      <w:r>
+        <w:rPr>
+          <w:rFonts w:ascii="Times New Roman" w:hAnsi="Times New Roman" w:cs="Times New Roman"/>
+          <w:sz w:val="22"/>
+        </w:rPr>
+        <w:t xml:space="preserve"> процессы предназначены для производства продукта или услуги одного наименования, назначения.</w:t>
+      </w:r>
+    </w:p>
+    <w:p>
+      <w:pPr>
+        <w:pStyle w:val="a3"/>
+        <w:numPr>
+          <w:ilvl w:val="0"/>
+          <w:numId w:val="41"/>
+        </w:numPr>
+        <w:tabs>
+          <w:tab w:val="left" w:pos="2160"/>
+          <w:tab w:val="left" w:pos="3825"/>
+        </w:tabs>
+        <w:rPr>
+          <w:rFonts w:ascii="Times New Roman" w:hAnsi="Times New Roman" w:cs="Times New Roman"/>
+          <w:sz w:val="22"/>
+        </w:rPr>
+      </w:pPr>
+      <w:r>
+        <w:rPr>
+          <w:rFonts w:ascii="Times New Roman" w:hAnsi="Times New Roman" w:cs="Times New Roman"/>
+          <w:sz w:val="22"/>
+        </w:rPr>
+        <w:t>Типовой технологический процесс применяется для совокупности однородных по технологическим признакам услуг. Он разрабатывается на типового потребителя и содержит максимально возможный перечень услуг</w:t>
+      </w:r>
+    </w:p>
+    <w:p>
+      <w:pPr>
+        <w:pStyle w:val="a3"/>
+        <w:numPr>
+          <w:ilvl w:val="0"/>
+          <w:numId w:val="41"/>
+        </w:numPr>
+        <w:tabs>
+          <w:tab w:val="left" w:pos="2160"/>
+          <w:tab w:val="left" w:pos="3825"/>
+        </w:tabs>
+        <w:rPr>
+          <w:rFonts w:ascii="Times New Roman" w:hAnsi="Times New Roman" w:cs="Times New Roman"/>
+          <w:sz w:val="22"/>
+        </w:rPr>
+      </w:pPr>
+      <w:r>
+        <w:rPr>
+          <w:rFonts w:ascii="Times New Roman" w:hAnsi="Times New Roman" w:cs="Times New Roman"/>
+          <w:sz w:val="22"/>
+        </w:rPr>
+        <w:t xml:space="preserve">Групповой технологический процесс применяется для производства комплекса услуг с общими технологическими признаками </w:t>
+      </w:r>
+    </w:p>
+    <w:p>
+      <w:pPr>
+        <w:tabs>
+          <w:tab w:val="left" w:pos="2160"/>
+          <w:tab w:val="left" w:pos="3825"/>
+        </w:tabs>
+        <w:rPr>
+          <w:rFonts w:ascii="Times New Roman" w:hAnsi="Times New Roman" w:cs="Times New Roman"/>
+          <w:sz w:val="22"/>
+        </w:rPr>
+      </w:pPr>
+      <w:r>
+        <w:rPr>
+          <w:rFonts w:ascii="Times New Roman" w:hAnsi="Times New Roman" w:cs="Times New Roman"/>
+          <w:sz w:val="22"/>
+        </w:rPr>
+        <w:t>Технологии, обслуживающие туристскую отрасль, подразделяются на 3 сферы</w:t>
+      </w:r>
+    </w:p>
+    <w:p>
+      <w:pPr>
+        <w:pStyle w:val="a3"/>
+        <w:numPr>
+          <w:ilvl w:val="0"/>
+          <w:numId w:val="42"/>
+        </w:numPr>
+        <w:tabs>
+          <w:tab w:val="left" w:pos="2160"/>
+          <w:tab w:val="left" w:pos="3825"/>
+        </w:tabs>
+        <w:rPr>
+          <w:rFonts w:ascii="Times New Roman" w:hAnsi="Times New Roman" w:cs="Times New Roman"/>
+          <w:sz w:val="22"/>
+        </w:rPr>
+      </w:pPr>
+      <w:r>
+        <w:rPr>
+          <w:rFonts w:ascii="Times New Roman" w:hAnsi="Times New Roman" w:cs="Times New Roman"/>
+          <w:sz w:val="22"/>
+        </w:rPr>
+        <w:t xml:space="preserve">Транспортная техника </w:t>
+      </w:r>
+    </w:p>
+    <w:p>
+      <w:pPr>
+        <w:pStyle w:val="a3"/>
+        <w:numPr>
+          <w:ilvl w:val="0"/>
+          <w:numId w:val="42"/>
+        </w:numPr>
+        <w:tabs>
+          <w:tab w:val="left" w:pos="2160"/>
+          <w:tab w:val="left" w:pos="3825"/>
+        </w:tabs>
+        <w:rPr>
+          <w:rFonts w:ascii="Times New Roman" w:hAnsi="Times New Roman" w:cs="Times New Roman"/>
+          <w:sz w:val="22"/>
+        </w:rPr>
+      </w:pPr>
+      <w:r>
+        <w:rPr>
+          <w:rFonts w:ascii="Times New Roman" w:hAnsi="Times New Roman" w:cs="Times New Roman"/>
+          <w:sz w:val="22"/>
+        </w:rPr>
+        <w:t xml:space="preserve">Оснащение гостиниц и ресторанов </w:t>
+      </w:r>
+    </w:p>
+    <w:p>
+      <w:pPr>
+        <w:pStyle w:val="a3"/>
+        <w:numPr>
+          <w:ilvl w:val="0"/>
+          <w:numId w:val="42"/>
+        </w:numPr>
+        <w:tabs>
+          <w:tab w:val="left" w:pos="2160"/>
+          <w:tab w:val="left" w:pos="3825"/>
+        </w:tabs>
+        <w:rPr>
+          <w:rFonts w:ascii="Times New Roman" w:hAnsi="Times New Roman" w:cs="Times New Roman"/>
+          <w:sz w:val="22"/>
+        </w:rPr>
+      </w:pPr>
+      <w:r>
+        <w:rPr>
+          <w:rFonts w:ascii="Times New Roman" w:hAnsi="Times New Roman" w:cs="Times New Roman"/>
+          <w:sz w:val="22"/>
+        </w:rPr>
+        <w:t>Коммуникационная техника обусловлена развитием комп. Технологий</w:t>
+      </w:r>
+    </w:p>
+    <w:p>
+      <w:pPr>
+        <w:tabs>
+          <w:tab w:val="left" w:pos="2160"/>
+          <w:tab w:val="left" w:pos="3825"/>
+        </w:tabs>
+        <w:rPr>
+          <w:rFonts w:ascii="Times New Roman" w:hAnsi="Times New Roman" w:cs="Times New Roman"/>
+          <w:sz w:val="22"/>
+        </w:rPr>
+      </w:pPr>
+    </w:p>
+    <w:p>
+      <w:pPr>
+        <w:tabs>
+          <w:tab w:val="left" w:pos="2160"/>
+          <w:tab w:val="left" w:pos="3825"/>
+        </w:tabs>
+        <w:rPr>
+          <w:rFonts w:ascii="Times New Roman" w:hAnsi="Times New Roman" w:cs="Times New Roman"/>
+          <w:b/>
+          <w:sz w:val="22"/>
+        </w:rPr>
+      </w:pPr>
+      <w:r>
+        <w:rPr>
+          <w:rFonts w:ascii="Times New Roman" w:hAnsi="Times New Roman" w:cs="Times New Roman"/>
+          <w:b/>
+          <w:sz w:val="22"/>
+        </w:rPr>
+        <w:t>Шесть принципов рациональной организации производственного процесса в гостиничном предприятии</w:t>
+      </w:r>
+    </w:p>
+    <w:p>
+      <w:pPr>
+        <w:pStyle w:val="a3"/>
+        <w:numPr>
+          <w:ilvl w:val="0"/>
+          <w:numId w:val="43"/>
+        </w:numPr>
+        <w:tabs>
+          <w:tab w:val="left" w:pos="2160"/>
+          <w:tab w:val="left" w:pos="3825"/>
+        </w:tabs>
+        <w:rPr>
+          <w:rFonts w:ascii="Times New Roman" w:hAnsi="Times New Roman" w:cs="Times New Roman"/>
+          <w:sz w:val="22"/>
+        </w:rPr>
+      </w:pPr>
+      <w:r>
+        <w:rPr>
+          <w:rFonts w:ascii="Times New Roman" w:hAnsi="Times New Roman" w:cs="Times New Roman"/>
+          <w:sz w:val="22"/>
+        </w:rPr>
+        <w:t xml:space="preserve">Дифференциация – предполагает разделение производственного процесса на отдельные </w:t>
+      </w:r>
+    </w:p>
+    <w:p>
+      <w:pPr>
+        <w:tabs>
+          <w:tab w:val="left" w:pos="2160"/>
+          <w:tab w:val="left" w:pos="3825"/>
+        </w:tabs>
+        <w:ind w:left="360"/>
+        <w:rPr>
+          <w:rFonts w:ascii="Times New Roman" w:hAnsi="Times New Roman" w:cs="Times New Roman"/>
+          <w:sz w:val="22"/>
+        </w:rPr>
+      </w:pPr>
+      <w:r>
+        <w:rPr>
+          <w:rFonts w:ascii="Times New Roman" w:hAnsi="Times New Roman" w:cs="Times New Roman"/>
+          <w:sz w:val="22"/>
+        </w:rPr>
+        <w:t>технологические этапы, например, гостиничный цикл, который включает в себя: прием, регистрацию, обслуживание, выписку, и проводы гостя.</w:t>
+      </w:r>
+    </w:p>
+    <w:p>
+      <w:pPr>
+        <w:pStyle w:val="a3"/>
+        <w:numPr>
+          <w:ilvl w:val="0"/>
+          <w:numId w:val="43"/>
+        </w:numPr>
+        <w:tabs>
+          <w:tab w:val="left" w:pos="2160"/>
+          <w:tab w:val="left" w:pos="3825"/>
+        </w:tabs>
+        <w:rPr>
+          <w:rFonts w:ascii="Times New Roman" w:hAnsi="Times New Roman" w:cs="Times New Roman"/>
+          <w:sz w:val="22"/>
+        </w:rPr>
+      </w:pPr>
+      <w:r>
+        <w:rPr>
+          <w:rFonts w:ascii="Times New Roman" w:hAnsi="Times New Roman" w:cs="Times New Roman"/>
+          <w:sz w:val="22"/>
+        </w:rPr>
+        <w:lastRenderedPageBreak/>
+        <w:t>Специализация – основана на ограничении элементов производственного процесса, предполагает закрепление за каждым рабочим местом и подразделением строго ограниченной номенклатуры работ, операций.</w:t>
+      </w:r>
+    </w:p>
+    <w:p>
+      <w:pPr>
+        <w:pStyle w:val="a3"/>
+        <w:numPr>
+          <w:ilvl w:val="0"/>
+          <w:numId w:val="43"/>
+        </w:numPr>
+        <w:tabs>
+          <w:tab w:val="left" w:pos="2160"/>
+          <w:tab w:val="left" w:pos="3825"/>
+        </w:tabs>
+        <w:rPr>
+          <w:rFonts w:ascii="Times New Roman" w:hAnsi="Times New Roman" w:cs="Times New Roman"/>
+          <w:sz w:val="22"/>
+        </w:rPr>
+      </w:pPr>
+      <w:r>
+        <w:rPr>
+          <w:rFonts w:ascii="Times New Roman" w:hAnsi="Times New Roman" w:cs="Times New Roman"/>
+          <w:sz w:val="22"/>
+        </w:rPr>
+        <w:t>Пропорциональность – означает относительно равную загрузку рабочих мест.</w:t>
+      </w:r>
+    </w:p>
+    <w:p>
+      <w:pPr>
+        <w:pStyle w:val="a3"/>
+        <w:numPr>
+          <w:ilvl w:val="0"/>
+          <w:numId w:val="43"/>
+        </w:numPr>
+        <w:tabs>
+          <w:tab w:val="left" w:pos="2160"/>
+          <w:tab w:val="left" w:pos="3825"/>
+        </w:tabs>
+        <w:rPr>
+          <w:rFonts w:ascii="Times New Roman" w:hAnsi="Times New Roman" w:cs="Times New Roman"/>
+          <w:sz w:val="22"/>
+        </w:rPr>
+      </w:pPr>
+      <w:r>
+        <w:rPr>
+          <w:rFonts w:ascii="Times New Roman" w:hAnsi="Times New Roman" w:cs="Times New Roman"/>
+          <w:sz w:val="22"/>
+        </w:rPr>
+        <w:t xml:space="preserve">Непрерывность – заключается в том, что каждая операция процесса должна начинаться по окончанию предыдущей, например, при </w:t>
+      </w:r>
+      <w:proofErr w:type="spellStart"/>
+      <w:r>
+        <w:rPr>
+          <w:rFonts w:ascii="Times New Roman" w:hAnsi="Times New Roman" w:cs="Times New Roman"/>
+          <w:sz w:val="22"/>
+        </w:rPr>
+        <w:t>обсулживании</w:t>
+      </w:r>
+      <w:proofErr w:type="spellEnd"/>
+      <w:r>
+        <w:rPr>
+          <w:rFonts w:ascii="Times New Roman" w:hAnsi="Times New Roman" w:cs="Times New Roman"/>
+          <w:sz w:val="22"/>
+        </w:rPr>
+        <w:t xml:space="preserve"> клиента в баре, при регистрации клиента на </w:t>
+      </w:r>
+      <w:proofErr w:type="spellStart"/>
+      <w:r>
+        <w:rPr>
+          <w:rFonts w:ascii="Times New Roman" w:hAnsi="Times New Roman" w:cs="Times New Roman"/>
+          <w:sz w:val="22"/>
+        </w:rPr>
+        <w:t>ресепшн</w:t>
+      </w:r>
+      <w:proofErr w:type="spellEnd"/>
+    </w:p>
+    <w:p>
+      <w:pPr>
+        <w:pStyle w:val="a3"/>
+        <w:numPr>
+          <w:ilvl w:val="0"/>
+          <w:numId w:val="43"/>
+        </w:numPr>
+        <w:tabs>
+          <w:tab w:val="left" w:pos="2160"/>
+          <w:tab w:val="left" w:pos="3825"/>
+        </w:tabs>
+        <w:rPr>
+          <w:rFonts w:ascii="Times New Roman" w:hAnsi="Times New Roman" w:cs="Times New Roman"/>
+          <w:sz w:val="22"/>
+        </w:rPr>
+      </w:pPr>
+      <w:r>
+        <w:rPr>
+          <w:rFonts w:ascii="Times New Roman" w:hAnsi="Times New Roman" w:cs="Times New Roman"/>
+          <w:sz w:val="22"/>
+        </w:rPr>
+        <w:t xml:space="preserve">Параллельность – характеризуется тем, что отдельные операции выполняются одновременно. Параллельность достигается, например, при выписке клиента и </w:t>
+      </w:r>
+      <w:proofErr w:type="spellStart"/>
+      <w:r>
+        <w:rPr>
+          <w:rFonts w:ascii="Times New Roman" w:hAnsi="Times New Roman" w:cs="Times New Roman"/>
+          <w:sz w:val="22"/>
+        </w:rPr>
+        <w:t>СПиР</w:t>
+      </w:r>
+      <w:proofErr w:type="spellEnd"/>
+      <w:r>
+        <w:rPr>
+          <w:rFonts w:ascii="Times New Roman" w:hAnsi="Times New Roman" w:cs="Times New Roman"/>
+          <w:sz w:val="22"/>
+        </w:rPr>
+        <w:t>, и СНФ</w:t>
+      </w:r>
+    </w:p>
+    <w:p>
+      <w:pPr>
+        <w:pStyle w:val="a3"/>
+        <w:numPr>
+          <w:ilvl w:val="0"/>
+          <w:numId w:val="43"/>
+        </w:numPr>
+        <w:tabs>
+          <w:tab w:val="left" w:pos="2160"/>
+          <w:tab w:val="left" w:pos="3825"/>
+        </w:tabs>
+        <w:rPr>
+          <w:rFonts w:ascii="Times New Roman" w:hAnsi="Times New Roman" w:cs="Times New Roman"/>
+          <w:sz w:val="22"/>
+        </w:rPr>
+      </w:pPr>
+      <w:r>
+        <w:rPr>
+          <w:rFonts w:ascii="Times New Roman" w:hAnsi="Times New Roman" w:cs="Times New Roman"/>
+          <w:sz w:val="22"/>
+        </w:rPr>
+        <w:t xml:space="preserve">Ритмичность – означает, что все процессы и </w:t>
+      </w:r>
+      <w:proofErr w:type="spellStart"/>
+      <w:r>
+        <w:rPr>
+          <w:rFonts w:ascii="Times New Roman" w:hAnsi="Times New Roman" w:cs="Times New Roman"/>
+          <w:sz w:val="22"/>
+        </w:rPr>
+        <w:t>прозиводственный</w:t>
+      </w:r>
+      <w:proofErr w:type="spellEnd"/>
+      <w:r>
+        <w:rPr>
+          <w:rFonts w:ascii="Times New Roman" w:hAnsi="Times New Roman" w:cs="Times New Roman"/>
+          <w:sz w:val="22"/>
+        </w:rPr>
+        <w:t xml:space="preserve"> процесс в целом по обслуживанию клиентов в гостинице повторяются через периоды времени.</w:t>
+      </w:r>
       <w:bookmarkStart w:id="0" w:name="_GoBack"/>
       <w:bookmarkEnd w:id="0"/>
+      <w:r>
+        <w:rPr>
+          <w:rFonts w:ascii="Times New Roman" w:hAnsi="Times New Roman" w:cs="Times New Roman"/>
+          <w:sz w:val="22"/>
+        </w:rPr>
+        <w:t xml:space="preserve"> </w:t>
+      </w:r>
     </w:p>
     <w:sectPr>
       <w:pgSz w:w="11906" w:h="16838"/>
@@ -3431,6 +5992,95 @@
     </w:lvl>
   </w:abstractNum>
   <w:abstractNum w:abstractNumId="4" w15:restartNumberingAfterBreak="0">
+    <w:nsid w:val="1D6325D9"/>
+    <w:multiLevelType w:val="hybridMultilevel"/>
+    <w:tmpl w:val="B54CC684"/>
+    <w:lvl w:ilvl="0" w:tplc="0419000F">
+      <w:start w:val="1"/>
+      <w:numFmt w:val="decimal"/>
+      <w:lvlText w:val="%1."/>
+      <w:lvlJc w:val="left"/>
+      <w:pPr>
+        <w:ind w:left="720" w:hanging="360"/>
+      </w:pPr>
+      <w:rPr>
+        <w:rFonts w:hint="default"/>
+      </w:rPr>
+    </w:lvl>
+    <w:lvl w:ilvl="1" w:tplc="04190019" w:tentative="1">
+      <w:start w:val="1"/>
+      <w:numFmt w:val="lowerLetter"/>
+      <w:lvlText w:val="%2."/>
+      <w:lvlJc w:val="left"/>
+      <w:pPr>
+        <w:ind w:left="1440" w:hanging="360"/>
+      </w:pPr>
+    </w:lvl>
+    <w:lvl w:ilvl="2" w:tplc="0419001B" w:tentative="1">
+      <w:start w:val="1"/>
+      <w:numFmt w:val="lowerRoman"/>
+      <w:lvlText w:val="%3."/>
+      <w:lvlJc w:val="right"/>
+      <w:pPr>
+        <w:ind w:left="2160" w:hanging="180"/>
+      </w:pPr>
+    </w:lvl>
+    <w:lvl w:ilvl="3" w:tplc="0419000F" w:tentative="1">
+      <w:start w:val="1"/>
+      <w:numFmt w:val="decimal"/>
+      <w:lvlText w:val="%4."/>
+      <w:lvlJc w:val="left"/>
+      <w:pPr>
+        <w:ind w:left="2880" w:hanging="360"/>
+      </w:pPr>
+    </w:lvl>
+    <w:lvl w:ilvl="4" w:tplc="04190019" w:tentative="1">
+      <w:start w:val="1"/>
+      <w:numFmt w:val="lowerLetter"/>
+      <w:lvlText w:val="%5."/>
+      <w:lvlJc w:val="left"/>
+      <w:pPr>
+        <w:ind w:left="3600" w:hanging="360"/>
+      </w:pPr>
+    </w:lvl>
+    <w:lvl w:ilvl="5" w:tplc="0419001B" w:tentative="1">
+      <w:start w:val="1"/>
+      <w:numFmt w:val="lowerRoman"/>
+      <w:lvlText w:val="%6."/>
+      <w:lvlJc w:val="right"/>
+      <w:pPr>
+        <w:ind w:left="4320" w:hanging="180"/>
+      </w:pPr>
+    </w:lvl>
+    <w:lvl w:ilvl="6" w:tplc="0419000F" w:tentative="1">
+      <w:start w:val="1"/>
+      <w:numFmt w:val="decimal"/>
+      <w:lvlText w:val="%7."/>
+      <w:lvlJc w:val="left"/>
+      <w:pPr>
+        <w:ind w:left="5040" w:hanging="360"/>
+      </w:pPr>
+    </w:lvl>
+    <w:lvl w:ilvl="7" w:tplc="04190019" w:tentative="1">
+      <w:start w:val="1"/>
+      <w:numFmt w:val="lowerLetter"/>
+      <w:lvlText w:val="%8."/>
+      <w:lvlJc w:val="left"/>
+      <w:pPr>
+        <w:ind w:left="5760" w:hanging="360"/>
+      </w:pPr>
+    </w:lvl>
+    <w:lvl w:ilvl="8" w:tplc="0419001B" w:tentative="1">
+      <w:start w:val="1"/>
+      <w:numFmt w:val="lowerRoman"/>
+      <w:lvlText w:val="%9."/>
+      <w:lvlJc w:val="right"/>
+      <w:pPr>
+        <w:ind w:left="6480" w:hanging="180"/>
+      </w:pPr>
+    </w:lvl>
+  </w:abstractNum>
+  <w:abstractNum w:abstractNumId="5" w15:restartNumberingAfterBreak="0">
     <w:nsid w:val="204C2E08"/>
     <w:multiLevelType w:val="hybridMultilevel"/>
     <w:tmpl w:val="6B168E60"/>
@@ -3519,7 +6169,7 @@
       </w:pPr>
     </w:lvl>
   </w:abstractNum>
-  <w:abstractNum w:abstractNumId="5" w15:restartNumberingAfterBreak="0">
+  <w:abstractNum w:abstractNumId="6" w15:restartNumberingAfterBreak="0">
     <w:nsid w:val="23D9717C"/>
     <w:multiLevelType w:val="hybridMultilevel"/>
     <w:tmpl w:val="D666B108"/>
@@ -3632,7 +6282,7 @@
       </w:rPr>
     </w:lvl>
   </w:abstractNum>
-  <w:abstractNum w:abstractNumId="6" w15:restartNumberingAfterBreak="0">
+  <w:abstractNum w:abstractNumId="7" w15:restartNumberingAfterBreak="0">
     <w:nsid w:val="25835C13"/>
     <w:multiLevelType w:val="hybridMultilevel"/>
     <w:tmpl w:val="2CBC9892"/>
@@ -3745,7 +6395,7 @@
       </w:rPr>
     </w:lvl>
   </w:abstractNum>
-  <w:abstractNum w:abstractNumId="7" w15:restartNumberingAfterBreak="0">
+  <w:abstractNum w:abstractNumId="8" w15:restartNumberingAfterBreak="0">
     <w:nsid w:val="259C0496"/>
     <w:multiLevelType w:val="hybridMultilevel"/>
     <w:tmpl w:val="8A960718"/>
@@ -3834,7 +6484,96 @@
       </w:pPr>
     </w:lvl>
   </w:abstractNum>
-  <w:abstractNum w:abstractNumId="8" w15:restartNumberingAfterBreak="0">
+  <w:abstractNum w:abstractNumId="9" w15:restartNumberingAfterBreak="0">
+    <w:nsid w:val="28F736E8"/>
+    <w:multiLevelType w:val="hybridMultilevel"/>
+    <w:tmpl w:val="79124400"/>
+    <w:lvl w:ilvl="0" w:tplc="0419000F">
+      <w:start w:val="1"/>
+      <w:numFmt w:val="decimal"/>
+      <w:lvlText w:val="%1."/>
+      <w:lvlJc w:val="left"/>
+      <w:pPr>
+        <w:ind w:left="720" w:hanging="360"/>
+      </w:pPr>
+      <w:rPr>
+        <w:rFonts w:hint="default"/>
+      </w:rPr>
+    </w:lvl>
+    <w:lvl w:ilvl="1" w:tplc="04190019" w:tentative="1">
+      <w:start w:val="1"/>
+      <w:numFmt w:val="lowerLetter"/>
+      <w:lvlText w:val="%2."/>
+      <w:lvlJc w:val="left"/>
+      <w:pPr>
+        <w:ind w:left="1440" w:hanging="360"/>
+      </w:pPr>
+    </w:lvl>
+    <w:lvl w:ilvl="2" w:tplc="0419001B" w:tentative="1">
+      <w:start w:val="1"/>
+      <w:numFmt w:val="lowerRoman"/>
+      <w:lvlText w:val="%3."/>
+      <w:lvlJc w:val="right"/>
+      <w:pPr>
+        <w:ind w:left="2160" w:hanging="180"/>
+      </w:pPr>
+    </w:lvl>
+    <w:lvl w:ilvl="3" w:tplc="0419000F" w:tentative="1">
+      <w:start w:val="1"/>
+      <w:numFmt w:val="decimal"/>
+      <w:lvlText w:val="%4."/>
+      <w:lvlJc w:val="left"/>
+      <w:pPr>
+        <w:ind w:left="2880" w:hanging="360"/>
+      </w:pPr>
+    </w:lvl>
+    <w:lvl w:ilvl="4" w:tplc="04190019" w:tentative="1">
+      <w:start w:val="1"/>
+      <w:numFmt w:val="lowerLetter"/>
+      <w:lvlText w:val="%5."/>
+      <w:lvlJc w:val="left"/>
+      <w:pPr>
+        <w:ind w:left="3600" w:hanging="360"/>
+      </w:pPr>
+    </w:lvl>
+    <w:lvl w:ilvl="5" w:tplc="0419001B" w:tentative="1">
+      <w:start w:val="1"/>
+      <w:numFmt w:val="lowerRoman"/>
+      <w:lvlText w:val="%6."/>
+      <w:lvlJc w:val="right"/>
+      <w:pPr>
+        <w:ind w:left="4320" w:hanging="180"/>
+      </w:pPr>
+    </w:lvl>
+    <w:lvl w:ilvl="6" w:tplc="0419000F" w:tentative="1">
+      <w:start w:val="1"/>
+      <w:numFmt w:val="decimal"/>
+      <w:lvlText w:val="%7."/>
+      <w:lvlJc w:val="left"/>
+      <w:pPr>
+        <w:ind w:left="5040" w:hanging="360"/>
+      </w:pPr>
+    </w:lvl>
+    <w:lvl w:ilvl="7" w:tplc="04190019" w:tentative="1">
+      <w:start w:val="1"/>
+      <w:numFmt w:val="lowerLetter"/>
+      <w:lvlText w:val="%8."/>
+      <w:lvlJc w:val="left"/>
+      <w:pPr>
+        <w:ind w:left="5760" w:hanging="360"/>
+      </w:pPr>
+    </w:lvl>
+    <w:lvl w:ilvl="8" w:tplc="0419001B" w:tentative="1">
+      <w:start w:val="1"/>
+      <w:numFmt w:val="lowerRoman"/>
+      <w:lvlText w:val="%9."/>
+      <w:lvlJc w:val="right"/>
+      <w:pPr>
+        <w:ind w:left="6480" w:hanging="180"/>
+      </w:pPr>
+    </w:lvl>
+  </w:abstractNum>
+  <w:abstractNum w:abstractNumId="10" w15:restartNumberingAfterBreak="0">
     <w:nsid w:val="29B716A0"/>
     <w:multiLevelType w:val="hybridMultilevel"/>
     <w:tmpl w:val="3EFCDE3E"/>
@@ -3947,7 +6686,7 @@
       </w:rPr>
     </w:lvl>
   </w:abstractNum>
-  <w:abstractNum w:abstractNumId="9" w15:restartNumberingAfterBreak="0">
+  <w:abstractNum w:abstractNumId="11" w15:restartNumberingAfterBreak="0">
     <w:nsid w:val="2BAC135E"/>
     <w:multiLevelType w:val="hybridMultilevel"/>
     <w:tmpl w:val="3C026ABE"/>
@@ -4036,7 +6775,7 @@
       </w:pPr>
     </w:lvl>
   </w:abstractNum>
-  <w:abstractNum w:abstractNumId="10" w15:restartNumberingAfterBreak="0">
+  <w:abstractNum w:abstractNumId="12" w15:restartNumberingAfterBreak="0">
     <w:nsid w:val="32116DB0"/>
     <w:multiLevelType w:val="hybridMultilevel"/>
     <w:tmpl w:val="F31067A6"/>
@@ -4125,7 +6864,7 @@
       </w:pPr>
     </w:lvl>
   </w:abstractNum>
-  <w:abstractNum w:abstractNumId="11" w15:restartNumberingAfterBreak="0">
+  <w:abstractNum w:abstractNumId="13" w15:restartNumberingAfterBreak="0">
     <w:nsid w:val="34FD017E"/>
     <w:multiLevelType w:val="hybridMultilevel"/>
     <w:tmpl w:val="BDBC58E8"/>
@@ -4265,7 +7004,7 @@
       </w:rPr>
     </w:lvl>
   </w:abstractNum>
-  <w:abstractNum w:abstractNumId="12" w15:restartNumberingAfterBreak="0">
+  <w:abstractNum w:abstractNumId="14" w15:restartNumberingAfterBreak="0">
     <w:nsid w:val="3C151F56"/>
     <w:multiLevelType w:val="hybridMultilevel"/>
     <w:tmpl w:val="D1F89BA0"/>
@@ -4354,7 +7093,96 @@
       </w:pPr>
     </w:lvl>
   </w:abstractNum>
-  <w:abstractNum w:abstractNumId="13" w15:restartNumberingAfterBreak="0">
+  <w:abstractNum w:abstractNumId="15" w15:restartNumberingAfterBreak="0">
+    <w:nsid w:val="4268647A"/>
+    <w:multiLevelType w:val="hybridMultilevel"/>
+    <w:tmpl w:val="09740372"/>
+    <w:lvl w:ilvl="0" w:tplc="0419000F">
+      <w:start w:val="1"/>
+      <w:numFmt w:val="decimal"/>
+      <w:lvlText w:val="%1."/>
+      <w:lvlJc w:val="left"/>
+      <w:pPr>
+        <w:ind w:left="1068" w:hanging="360"/>
+      </w:pPr>
+      <w:rPr>
+        <w:rFonts w:hint="default"/>
+      </w:rPr>
+    </w:lvl>
+    <w:lvl w:ilvl="1" w:tplc="04190019" w:tentative="1">
+      <w:start w:val="1"/>
+      <w:numFmt w:val="lowerLetter"/>
+      <w:lvlText w:val="%2."/>
+      <w:lvlJc w:val="left"/>
+      <w:pPr>
+        <w:ind w:left="1788" w:hanging="360"/>
+      </w:pPr>
+    </w:lvl>
+    <w:lvl w:ilvl="2" w:tplc="0419001B" w:tentative="1">
+      <w:start w:val="1"/>
+      <w:numFmt w:val="lowerRoman"/>
+      <w:lvlText w:val="%3."/>
+      <w:lvlJc w:val="right"/>
+      <w:pPr>
+        <w:ind w:left="2508" w:hanging="180"/>
+      </w:pPr>
+    </w:lvl>
+    <w:lvl w:ilvl="3" w:tplc="0419000F" w:tentative="1">
+      <w:start w:val="1"/>
+      <w:numFmt w:val="decimal"/>
+      <w:lvlText w:val="%4."/>
+      <w:lvlJc w:val="left"/>
+      <w:pPr>
+        <w:ind w:left="3228" w:hanging="360"/>
+      </w:pPr>
+    </w:lvl>
+    <w:lvl w:ilvl="4" w:tplc="04190019" w:tentative="1">
+      <w:start w:val="1"/>
+      <w:numFmt w:val="lowerLetter"/>
+      <w:lvlText w:val="%5."/>
+      <w:lvlJc w:val="left"/>
+      <w:pPr>
+        <w:ind w:left="3948" w:hanging="360"/>
+      </w:pPr>
+    </w:lvl>
+    <w:lvl w:ilvl="5" w:tplc="0419001B" w:tentative="1">
+      <w:start w:val="1"/>
+      <w:numFmt w:val="lowerRoman"/>
+      <w:lvlText w:val="%6."/>
+      <w:lvlJc w:val="right"/>
+      <w:pPr>
+        <w:ind w:left="4668" w:hanging="180"/>
+      </w:pPr>
+    </w:lvl>
+    <w:lvl w:ilvl="6" w:tplc="0419000F" w:tentative="1">
+      <w:start w:val="1"/>
+      <w:numFmt w:val="decimal"/>
+      <w:lvlText w:val="%7."/>
+      <w:lvlJc w:val="left"/>
+      <w:pPr>
+        <w:ind w:left="5388" w:hanging="360"/>
+      </w:pPr>
+    </w:lvl>
+    <w:lvl w:ilvl="7" w:tplc="04190019" w:tentative="1">
+      <w:start w:val="1"/>
+      <w:numFmt w:val="lowerLetter"/>
+      <w:lvlText w:val="%8."/>
+      <w:lvlJc w:val="left"/>
+      <w:pPr>
+        <w:ind w:left="6108" w:hanging="360"/>
+      </w:pPr>
+    </w:lvl>
+    <w:lvl w:ilvl="8" w:tplc="0419001B" w:tentative="1">
+      <w:start w:val="1"/>
+      <w:numFmt w:val="lowerRoman"/>
+      <w:lvlText w:val="%9."/>
+      <w:lvlJc w:val="right"/>
+      <w:pPr>
+        <w:ind w:left="6828" w:hanging="180"/>
+      </w:pPr>
+    </w:lvl>
+  </w:abstractNum>
+  <w:abstractNum w:abstractNumId="16" w15:restartNumberingAfterBreak="0">
     <w:nsid w:val="44AA7788"/>
     <w:multiLevelType w:val="hybridMultilevel"/>
     <w:tmpl w:val="E2DE115E"/>
@@ -4467,7 +7295,96 @@
       </w:rPr>
     </w:lvl>
   </w:abstractNum>
-  <w:abstractNum w:abstractNumId="14" w15:restartNumberingAfterBreak="0">
+  <w:abstractNum w:abstractNumId="17" w15:restartNumberingAfterBreak="0">
+    <w:nsid w:val="490E5B9C"/>
+    <w:multiLevelType w:val="hybridMultilevel"/>
+    <w:tmpl w:val="F9EA0936"/>
+    <w:lvl w:ilvl="0" w:tplc="0419000F">
+      <w:start w:val="1"/>
+      <w:numFmt w:val="decimal"/>
+      <w:lvlText w:val="%1."/>
+      <w:lvlJc w:val="left"/>
+      <w:pPr>
+        <w:ind w:left="720" w:hanging="360"/>
+      </w:pPr>
+      <w:rPr>
+        <w:rFonts w:hint="default"/>
+      </w:rPr>
+    </w:lvl>
+    <w:lvl w:ilvl="1" w:tplc="04190019" w:tentative="1">
+      <w:start w:val="1"/>
+      <w:numFmt w:val="lowerLetter"/>
+      <w:lvlText w:val="%2."/>
+      <w:lvlJc w:val="left"/>
+      <w:pPr>
+        <w:ind w:left="1440" w:hanging="360"/>
+      </w:pPr>
+    </w:lvl>
+    <w:lvl w:ilvl="2" w:tplc="0419001B" w:tentative="1">
+      <w:start w:val="1"/>
+      <w:numFmt w:val="lowerRoman"/>
+      <w:lvlText w:val="%3."/>
+      <w:lvlJc w:val="right"/>
+      <w:pPr>
+        <w:ind w:left="2160" w:hanging="180"/>
+      </w:pPr>
+    </w:lvl>
+    <w:lvl w:ilvl="3" w:tplc="0419000F" w:tentative="1">
+      <w:start w:val="1"/>
+      <w:numFmt w:val="decimal"/>
+      <w:lvlText w:val="%4."/>
+      <w:lvlJc w:val="left"/>
+      <w:pPr>
+        <w:ind w:left="2880" w:hanging="360"/>
+      </w:pPr>
+    </w:lvl>
+    <w:lvl w:ilvl="4" w:tplc="04190019" w:tentative="1">
+      <w:start w:val="1"/>
+      <w:numFmt w:val="lowerLetter"/>
+      <w:lvlText w:val="%5."/>
+      <w:lvlJc w:val="left"/>
+      <w:pPr>
+        <w:ind w:left="3600" w:hanging="360"/>
+      </w:pPr>
+    </w:lvl>
+    <w:lvl w:ilvl="5" w:tplc="0419001B" w:tentative="1">
+      <w:start w:val="1"/>
+      <w:numFmt w:val="lowerRoman"/>
+      <w:lvlText w:val="%6."/>
+      <w:lvlJc w:val="right"/>
+      <w:pPr>
+        <w:ind w:left="4320" w:hanging="180"/>
+      </w:pPr>
+    </w:lvl>
+    <w:lvl w:ilvl="6" w:tplc="0419000F" w:tentative="1">
+      <w:start w:val="1"/>
+      <w:numFmt w:val="decimal"/>
+      <w:lvlText w:val="%7."/>
+      <w:lvlJc w:val="left"/>
+      <w:pPr>
+        <w:ind w:left="5040" w:hanging="360"/>
+      </w:pPr>
+    </w:lvl>
+    <w:lvl w:ilvl="7" w:tplc="04190019" w:tentative="1">
+      <w:start w:val="1"/>
+      <w:numFmt w:val="lowerLetter"/>
+      <w:lvlText w:val="%8."/>
+      <w:lvlJc w:val="left"/>
+      <w:pPr>
+        <w:ind w:left="5760" w:hanging="360"/>
+      </w:pPr>
+    </w:lvl>
+    <w:lvl w:ilvl="8" w:tplc="0419001B" w:tentative="1">
+      <w:start w:val="1"/>
+      <w:numFmt w:val="lowerRoman"/>
+      <w:lvlText w:val="%9."/>
+      <w:lvlJc w:val="right"/>
+      <w:pPr>
+        <w:ind w:left="6480" w:hanging="180"/>
+      </w:pPr>
+    </w:lvl>
+  </w:abstractNum>
+  <w:abstractNum w:abstractNumId="18" w15:restartNumberingAfterBreak="0">
     <w:nsid w:val="498375E5"/>
     <w:multiLevelType w:val="hybridMultilevel"/>
     <w:tmpl w:val="2736A878"/>
@@ -4607,7 +7524,7 @@
       </w:rPr>
     </w:lvl>
   </w:abstractNum>
-  <w:abstractNum w:abstractNumId="15" w15:restartNumberingAfterBreak="0">
+  <w:abstractNum w:abstractNumId="19" w15:restartNumberingAfterBreak="0">
     <w:nsid w:val="4B860AE4"/>
     <w:multiLevelType w:val="hybridMultilevel"/>
     <w:tmpl w:val="FADC6522"/>
@@ -4720,7 +7637,7 @@
       </w:rPr>
     </w:lvl>
   </w:abstractNum>
-  <w:abstractNum w:abstractNumId="16" w15:restartNumberingAfterBreak="0">
+  <w:abstractNum w:abstractNumId="20" w15:restartNumberingAfterBreak="0">
     <w:nsid w:val="4B9B2D0C"/>
     <w:multiLevelType w:val="hybridMultilevel"/>
     <w:tmpl w:val="D19A7A92"/>
@@ -4833,7 +7750,185 @@
       </w:rPr>
     </w:lvl>
   </w:abstractNum>
-  <w:abstractNum w:abstractNumId="17" w15:restartNumberingAfterBreak="0">
+  <w:abstractNum w:abstractNumId="21" w15:restartNumberingAfterBreak="0">
+    <w:nsid w:val="4D481295"/>
+    <w:multiLevelType w:val="hybridMultilevel"/>
+    <w:tmpl w:val="35FA1274"/>
+    <w:lvl w:ilvl="0" w:tplc="0419000F">
+      <w:start w:val="1"/>
+      <w:numFmt w:val="decimal"/>
+      <w:lvlText w:val="%1."/>
+      <w:lvlJc w:val="left"/>
+      <w:pPr>
+        <w:ind w:left="720" w:hanging="360"/>
+      </w:pPr>
+      <w:rPr>
+        <w:rFonts w:hint="default"/>
+      </w:rPr>
+    </w:lvl>
+    <w:lvl w:ilvl="1" w:tplc="04190019" w:tentative="1">
+      <w:start w:val="1"/>
+      <w:numFmt w:val="lowerLetter"/>
+      <w:lvlText w:val="%2."/>
+      <w:lvlJc w:val="left"/>
+      <w:pPr>
+        <w:ind w:left="1440" w:hanging="360"/>
+      </w:pPr>
+    </w:lvl>
+    <w:lvl w:ilvl="2" w:tplc="0419001B" w:tentative="1">
+      <w:start w:val="1"/>
+      <w:numFmt w:val="lowerRoman"/>
+      <w:lvlText w:val="%3."/>
+      <w:lvlJc w:val="right"/>
+      <w:pPr>
+        <w:ind w:left="2160" w:hanging="180"/>
+      </w:pPr>
+    </w:lvl>
+    <w:lvl w:ilvl="3" w:tplc="0419000F" w:tentative="1">
+      <w:start w:val="1"/>
+      <w:numFmt w:val="decimal"/>
+      <w:lvlText w:val="%4."/>
+      <w:lvlJc w:val="left"/>
+      <w:pPr>
+        <w:ind w:left="2880" w:hanging="360"/>
+      </w:pPr>
+    </w:lvl>
+    <w:lvl w:ilvl="4" w:tplc="04190019" w:tentative="1">
+      <w:start w:val="1"/>
+      <w:numFmt w:val="lowerLetter"/>
+      <w:lvlText w:val="%5."/>
+      <w:lvlJc w:val="left"/>
+      <w:pPr>
+        <w:ind w:left="3600" w:hanging="360"/>
+      </w:pPr>
+    </w:lvl>
+    <w:lvl w:ilvl="5" w:tplc="0419001B" w:tentative="1">
+      <w:start w:val="1"/>
+      <w:numFmt w:val="lowerRoman"/>
+      <w:lvlText w:val="%6."/>
+      <w:lvlJc w:val="right"/>
+      <w:pPr>
+        <w:ind w:left="4320" w:hanging="180"/>
+      </w:pPr>
+    </w:lvl>
+    <w:lvl w:ilvl="6" w:tplc="0419000F" w:tentative="1">
+      <w:start w:val="1"/>
+      <w:numFmt w:val="decimal"/>
+      <w:lvlText w:val="%7."/>
+      <w:lvlJc w:val="left"/>
+      <w:pPr>
+        <w:ind w:left="5040" w:hanging="360"/>
+      </w:pPr>
+    </w:lvl>
+    <w:lvl w:ilvl="7" w:tplc="04190019" w:tentative="1">
+      <w:start w:val="1"/>
+      <w:numFmt w:val="lowerLetter"/>
+      <w:lvlText w:val="%8."/>
+      <w:lvlJc w:val="left"/>
+      <w:pPr>
+        <w:ind w:left="5760" w:hanging="360"/>
+      </w:pPr>
+    </w:lvl>
+    <w:lvl w:ilvl="8" w:tplc="0419001B" w:tentative="1">
+      <w:start w:val="1"/>
+      <w:numFmt w:val="lowerRoman"/>
+      <w:lvlText w:val="%9."/>
+      <w:lvlJc w:val="right"/>
+      <w:pPr>
+        <w:ind w:left="6480" w:hanging="180"/>
+      </w:pPr>
+    </w:lvl>
+  </w:abstractNum>
+  <w:abstractNum w:abstractNumId="22" w15:restartNumberingAfterBreak="0">
+    <w:nsid w:val="4D7010E0"/>
+    <w:multiLevelType w:val="hybridMultilevel"/>
+    <w:tmpl w:val="BEEE3C18"/>
+    <w:lvl w:ilvl="0" w:tplc="0419000F">
+      <w:start w:val="1"/>
+      <w:numFmt w:val="decimal"/>
+      <w:lvlText w:val="%1."/>
+      <w:lvlJc w:val="left"/>
+      <w:pPr>
+        <w:ind w:left="720" w:hanging="360"/>
+      </w:pPr>
+      <w:rPr>
+        <w:rFonts w:hint="default"/>
+      </w:rPr>
+    </w:lvl>
+    <w:lvl w:ilvl="1" w:tplc="04190019" w:tentative="1">
+      <w:start w:val="1"/>
+      <w:numFmt w:val="lowerLetter"/>
+      <w:lvlText w:val="%2."/>
+      <w:lvlJc w:val="left"/>
+      <w:pPr>
+        <w:ind w:left="1440" w:hanging="360"/>
+      </w:pPr>
+    </w:lvl>
+    <w:lvl w:ilvl="2" w:tplc="0419001B" w:tentative="1">
+      <w:start w:val="1"/>
+      <w:numFmt w:val="lowerRoman"/>
+      <w:lvlText w:val="%3."/>
+      <w:lvlJc w:val="right"/>
+      <w:pPr>
+        <w:ind w:left="2160" w:hanging="180"/>
+      </w:pPr>
+    </w:lvl>
+    <w:lvl w:ilvl="3" w:tplc="0419000F" w:tentative="1">
+      <w:start w:val="1"/>
+      <w:numFmt w:val="decimal"/>
+      <w:lvlText w:val="%4."/>
+      <w:lvlJc w:val="left"/>
+      <w:pPr>
+        <w:ind w:left="2880" w:hanging="360"/>
+      </w:pPr>
+    </w:lvl>
+    <w:lvl w:ilvl="4" w:tplc="04190019" w:tentative="1">
+      <w:start w:val="1"/>
+      <w:numFmt w:val="lowerLetter"/>
+      <w:lvlText w:val="%5."/>
+      <w:lvlJc w:val="left"/>
+      <w:pPr>
+        <w:ind w:left="3600" w:hanging="360"/>
+      </w:pPr>
+    </w:lvl>
+    <w:lvl w:ilvl="5" w:tplc="0419001B" w:tentative="1">
+      <w:start w:val="1"/>
+      <w:numFmt w:val="lowerRoman"/>
+      <w:lvlText w:val="%6."/>
+      <w:lvlJc w:val="right"/>
+      <w:pPr>
+        <w:ind w:left="4320" w:hanging="180"/>
+      </w:pPr>
+    </w:lvl>
+    <w:lvl w:ilvl="6" w:tplc="0419000F" w:tentative="1">
+      <w:start w:val="1"/>
+      <w:numFmt w:val="decimal"/>
+      <w:lvlText w:val="%7."/>
+      <w:lvlJc w:val="left"/>
+      <w:pPr>
+        <w:ind w:left="5040" w:hanging="360"/>
+      </w:pPr>
+    </w:lvl>
+    <w:lvl w:ilvl="7" w:tplc="04190019" w:tentative="1">
+      <w:start w:val="1"/>
+      <w:numFmt w:val="lowerLetter"/>
+      <w:lvlText w:val="%8."/>
+      <w:lvlJc w:val="left"/>
+      <w:pPr>
+        <w:ind w:left="5760" w:hanging="360"/>
+      </w:pPr>
+    </w:lvl>
+    <w:lvl w:ilvl="8" w:tplc="0419001B" w:tentative="1">
+      <w:start w:val="1"/>
+      <w:numFmt w:val="lowerRoman"/>
+      <w:lvlText w:val="%9."/>
+      <w:lvlJc w:val="right"/>
+      <w:pPr>
+        <w:ind w:left="6480" w:hanging="180"/>
+      </w:pPr>
+    </w:lvl>
+  </w:abstractNum>
+  <w:abstractNum w:abstractNumId="23" w15:restartNumberingAfterBreak="0">
     <w:nsid w:val="4E1D69CA"/>
     <w:multiLevelType w:val="hybridMultilevel"/>
     <w:tmpl w:val="95D48FAE"/>
@@ -4946,7 +8041,7 @@
       </w:rPr>
     </w:lvl>
   </w:abstractNum>
-  <w:abstractNum w:abstractNumId="18" w15:restartNumberingAfterBreak="0">
+  <w:abstractNum w:abstractNumId="24" w15:restartNumberingAfterBreak="0">
     <w:nsid w:val="53DD17BC"/>
     <w:multiLevelType w:val="hybridMultilevel"/>
     <w:tmpl w:val="60923424"/>
@@ -5059,7 +8154,7 @@
       </w:rPr>
     </w:lvl>
   </w:abstractNum>
-  <w:abstractNum w:abstractNumId="19" w15:restartNumberingAfterBreak="0">
+  <w:abstractNum w:abstractNumId="25" w15:restartNumberingAfterBreak="0">
     <w:nsid w:val="567B7BCF"/>
     <w:multiLevelType w:val="hybridMultilevel"/>
     <w:tmpl w:val="0EE81756"/>
@@ -5172,7 +8267,96 @@
       </w:rPr>
     </w:lvl>
   </w:abstractNum>
-  <w:abstractNum w:abstractNumId="20" w15:restartNumberingAfterBreak="0">
+  <w:abstractNum w:abstractNumId="26" w15:restartNumberingAfterBreak="0">
+    <w:nsid w:val="57756D4A"/>
+    <w:multiLevelType w:val="hybridMultilevel"/>
+    <w:tmpl w:val="8B642762"/>
+    <w:lvl w:ilvl="0" w:tplc="0419000F">
+      <w:start w:val="1"/>
+      <w:numFmt w:val="decimal"/>
+      <w:lvlText w:val="%1."/>
+      <w:lvlJc w:val="left"/>
+      <w:pPr>
+        <w:ind w:left="720" w:hanging="360"/>
+      </w:pPr>
+      <w:rPr>
+        <w:rFonts w:hint="default"/>
+      </w:rPr>
+    </w:lvl>
+    <w:lvl w:ilvl="1" w:tplc="04190019" w:tentative="1">
+      <w:start w:val="1"/>
+      <w:numFmt w:val="lowerLetter"/>
+      <w:lvlText w:val="%2."/>
+      <w:lvlJc w:val="left"/>
+      <w:pPr>
+        <w:ind w:left="1440" w:hanging="360"/>
+      </w:pPr>
+    </w:lvl>
+    <w:lvl w:ilvl="2" w:tplc="0419001B" w:tentative="1">
+      <w:start w:val="1"/>
+      <w:numFmt w:val="lowerRoman"/>
+      <w:lvlText w:val="%3."/>
+      <w:lvlJc w:val="right"/>
+      <w:pPr>
+        <w:ind w:left="2160" w:hanging="180"/>
+      </w:pPr>
+    </w:lvl>
+    <w:lvl w:ilvl="3" w:tplc="0419000F" w:tentative="1">
+      <w:start w:val="1"/>
+      <w:numFmt w:val="decimal"/>
+      <w:lvlText w:val="%4."/>
+      <w:lvlJc w:val="left"/>
+      <w:pPr>
+        <w:ind w:left="2880" w:hanging="360"/>
+      </w:pPr>
+    </w:lvl>
+    <w:lvl w:ilvl="4" w:tplc="04190019" w:tentative="1">
+      <w:start w:val="1"/>
+      <w:numFmt w:val="lowerLetter"/>
+      <w:lvlText w:val="%5."/>
+      <w:lvlJc w:val="left"/>
+      <w:pPr>
+        <w:ind w:left="3600" w:hanging="360"/>
+      </w:pPr>
+    </w:lvl>
+    <w:lvl w:ilvl="5" w:tplc="0419001B" w:tentative="1">
+      <w:start w:val="1"/>
+      <w:numFmt w:val="lowerRoman"/>
+      <w:lvlText w:val="%6."/>
+      <w:lvlJc w:val="right"/>
+      <w:pPr>
+        <w:ind w:left="4320" w:hanging="180"/>
+      </w:pPr>
+    </w:lvl>
+    <w:lvl w:ilvl="6" w:tplc="0419000F" w:tentative="1">
+      <w:start w:val="1"/>
+      <w:numFmt w:val="decimal"/>
+      <w:lvlText w:val="%7."/>
+      <w:lvlJc w:val="left"/>
+      <w:pPr>
+        <w:ind w:left="5040" w:hanging="360"/>
+      </w:pPr>
+    </w:lvl>
+    <w:lvl w:ilvl="7" w:tplc="04190019" w:tentative="1">
+      <w:start w:val="1"/>
+      <w:numFmt w:val="lowerLetter"/>
+      <w:lvlText w:val="%8."/>
+      <w:lvlJc w:val="left"/>
+      <w:pPr>
+        <w:ind w:left="5760" w:hanging="360"/>
+      </w:pPr>
+    </w:lvl>
+    <w:lvl w:ilvl="8" w:tplc="0419001B" w:tentative="1">
+      <w:start w:val="1"/>
+      <w:numFmt w:val="lowerRoman"/>
+      <w:lvlText w:val="%9."/>
+      <w:lvlJc w:val="right"/>
+      <w:pPr>
+        <w:ind w:left="6480" w:hanging="180"/>
+      </w:pPr>
+    </w:lvl>
+  </w:abstractNum>
+  <w:abstractNum w:abstractNumId="27" w15:restartNumberingAfterBreak="0">
     <w:nsid w:val="5E731FE6"/>
     <w:multiLevelType w:val="hybridMultilevel"/>
     <w:tmpl w:val="D9124B32"/>
@@ -5258,7 +8442,96 @@
       </w:pPr>
     </w:lvl>
   </w:abstractNum>
-  <w:abstractNum w:abstractNumId="21" w15:restartNumberingAfterBreak="0">
+  <w:abstractNum w:abstractNumId="28" w15:restartNumberingAfterBreak="0">
+    <w:nsid w:val="5F626FB3"/>
+    <w:multiLevelType w:val="hybridMultilevel"/>
+    <w:tmpl w:val="9C2AA78A"/>
+    <w:lvl w:ilvl="0" w:tplc="0419000F">
+      <w:start w:val="1"/>
+      <w:numFmt w:val="decimal"/>
+      <w:lvlText w:val="%1."/>
+      <w:lvlJc w:val="left"/>
+      <w:pPr>
+        <w:ind w:left="720" w:hanging="360"/>
+      </w:pPr>
+      <w:rPr>
+        <w:rFonts w:hint="default"/>
+      </w:rPr>
+    </w:lvl>
+    <w:lvl w:ilvl="1" w:tplc="04190019" w:tentative="1">
+      <w:start w:val="1"/>
+      <w:numFmt w:val="lowerLetter"/>
+      <w:lvlText w:val="%2."/>
+      <w:lvlJc w:val="left"/>
+      <w:pPr>
+        <w:ind w:left="1440" w:hanging="360"/>
+      </w:pPr>
+    </w:lvl>
+    <w:lvl w:ilvl="2" w:tplc="0419001B" w:tentative="1">
+      <w:start w:val="1"/>
+      <w:numFmt w:val="lowerRoman"/>
+      <w:lvlText w:val="%3."/>
+      <w:lvlJc w:val="right"/>
+      <w:pPr>
+        <w:ind w:left="2160" w:hanging="180"/>
+      </w:pPr>
+    </w:lvl>
+    <w:lvl w:ilvl="3" w:tplc="0419000F" w:tentative="1">
+      <w:start w:val="1"/>
+      <w:numFmt w:val="decimal"/>
+      <w:lvlText w:val="%4."/>
+      <w:lvlJc w:val="left"/>
+      <w:pPr>
+        <w:ind w:left="2880" w:hanging="360"/>
+      </w:pPr>
+    </w:lvl>
+    <w:lvl w:ilvl="4" w:tplc="04190019" w:tentative="1">
+      <w:start w:val="1"/>
+      <w:numFmt w:val="lowerLetter"/>
+      <w:lvlText w:val="%5."/>
+      <w:lvlJc w:val="left"/>
+      <w:pPr>
+        <w:ind w:left="3600" w:hanging="360"/>
+      </w:pPr>
+    </w:lvl>
+    <w:lvl w:ilvl="5" w:tplc="0419001B" w:tentative="1">
+      <w:start w:val="1"/>
+      <w:numFmt w:val="lowerRoman"/>
+      <w:lvlText w:val="%6."/>
+      <w:lvlJc w:val="right"/>
+      <w:pPr>
+        <w:ind w:left="4320" w:hanging="180"/>
+      </w:pPr>
+    </w:lvl>
+    <w:lvl w:ilvl="6" w:tplc="0419000F" w:tentative="1">
+      <w:start w:val="1"/>
+      <w:numFmt w:val="decimal"/>
+      <w:lvlText w:val="%7."/>
+      <w:lvlJc w:val="left"/>
+      <w:pPr>
+        <w:ind w:left="5040" w:hanging="360"/>
+      </w:pPr>
+    </w:lvl>
+    <w:lvl w:ilvl="7" w:tplc="04190019" w:tentative="1">
+      <w:start w:val="1"/>
+      <w:numFmt w:val="lowerLetter"/>
+      <w:lvlText w:val="%8."/>
+      <w:lvlJc w:val="left"/>
+      <w:pPr>
+        <w:ind w:left="5760" w:hanging="360"/>
+      </w:pPr>
+    </w:lvl>
+    <w:lvl w:ilvl="8" w:tplc="0419001B" w:tentative="1">
+      <w:start w:val="1"/>
+      <w:numFmt w:val="lowerRoman"/>
+      <w:lvlText w:val="%9."/>
+      <w:lvlJc w:val="right"/>
+      <w:pPr>
+        <w:ind w:left="6480" w:hanging="180"/>
+      </w:pPr>
+    </w:lvl>
+  </w:abstractNum>
+  <w:abstractNum w:abstractNumId="29" w15:restartNumberingAfterBreak="0">
     <w:nsid w:val="5F6F6CB5"/>
     <w:multiLevelType w:val="hybridMultilevel"/>
     <w:tmpl w:val="3EEE8A0E"/>
@@ -5398,7 +8671,7 @@
       </w:rPr>
     </w:lvl>
   </w:abstractNum>
-  <w:abstractNum w:abstractNumId="22" w15:restartNumberingAfterBreak="0">
+  <w:abstractNum w:abstractNumId="30" w15:restartNumberingAfterBreak="0">
     <w:nsid w:val="5FCC674A"/>
     <w:multiLevelType w:val="hybridMultilevel"/>
     <w:tmpl w:val="B98CB84A"/>
@@ -5487,7 +8760,7 @@
       </w:pPr>
     </w:lvl>
   </w:abstractNum>
-  <w:abstractNum w:abstractNumId="23" w15:restartNumberingAfterBreak="0">
+  <w:abstractNum w:abstractNumId="31" w15:restartNumberingAfterBreak="0">
     <w:nsid w:val="62D37CBE"/>
     <w:multiLevelType w:val="hybridMultilevel"/>
     <w:tmpl w:val="D2849A0A"/>
@@ -5576,7 +8849,7 @@
       </w:pPr>
     </w:lvl>
   </w:abstractNum>
-  <w:abstractNum w:abstractNumId="24" w15:restartNumberingAfterBreak="0">
+  <w:abstractNum w:abstractNumId="32" w15:restartNumberingAfterBreak="0">
     <w:nsid w:val="65D97D6B"/>
     <w:multiLevelType w:val="hybridMultilevel"/>
     <w:tmpl w:val="9782D63A"/>
@@ -5716,7 +8989,7 @@
       </w:rPr>
     </w:lvl>
   </w:abstractNum>
-  <w:abstractNum w:abstractNumId="25" w15:restartNumberingAfterBreak="0">
+  <w:abstractNum w:abstractNumId="33" w15:restartNumberingAfterBreak="0">
     <w:nsid w:val="66966573"/>
     <w:multiLevelType w:val="hybridMultilevel"/>
     <w:tmpl w:val="86AA9300"/>
@@ -5856,7 +9129,7 @@
       </w:rPr>
     </w:lvl>
   </w:abstractNum>
-  <w:abstractNum w:abstractNumId="26" w15:restartNumberingAfterBreak="0">
+  <w:abstractNum w:abstractNumId="34" w15:restartNumberingAfterBreak="0">
     <w:nsid w:val="678348DC"/>
     <w:multiLevelType w:val="hybridMultilevel"/>
     <w:tmpl w:val="AD8C601A"/>
@@ -5996,7 +9269,7 @@
       </w:rPr>
     </w:lvl>
   </w:abstractNum>
-  <w:abstractNum w:abstractNumId="27" w15:restartNumberingAfterBreak="0">
+  <w:abstractNum w:abstractNumId="35" w15:restartNumberingAfterBreak="0">
     <w:nsid w:val="67D93623"/>
     <w:multiLevelType w:val="hybridMultilevel"/>
     <w:tmpl w:val="1BD63710"/>
@@ -6109,7 +9382,96 @@
       </w:rPr>
     </w:lvl>
   </w:abstractNum>
-  <w:abstractNum w:abstractNumId="28" w15:restartNumberingAfterBreak="0">
+  <w:abstractNum w:abstractNumId="36" w15:restartNumberingAfterBreak="0">
+    <w:nsid w:val="687C181D"/>
+    <w:multiLevelType w:val="hybridMultilevel"/>
+    <w:tmpl w:val="33DE5D56"/>
+    <w:lvl w:ilvl="0" w:tplc="0419000F">
+      <w:start w:val="1"/>
+      <w:numFmt w:val="decimal"/>
+      <w:lvlText w:val="%1."/>
+      <w:lvlJc w:val="left"/>
+      <w:pPr>
+        <w:ind w:left="720" w:hanging="360"/>
+      </w:pPr>
+      <w:rPr>
+        <w:rFonts w:hint="default"/>
+      </w:rPr>
+    </w:lvl>
+    <w:lvl w:ilvl="1" w:tplc="04190019" w:tentative="1">
+      <w:start w:val="1"/>
+      <w:numFmt w:val="lowerLetter"/>
+      <w:lvlText w:val="%2."/>
+      <w:lvlJc w:val="left"/>
+      <w:pPr>
+        <w:ind w:left="1440" w:hanging="360"/>
+      </w:pPr>
+    </w:lvl>
+    <w:lvl w:ilvl="2" w:tplc="0419001B" w:tentative="1">
+      <w:start w:val="1"/>
+      <w:numFmt w:val="lowerRoman"/>
+      <w:lvlText w:val="%3."/>
+      <w:lvlJc w:val="right"/>
+      <w:pPr>
+        <w:ind w:left="2160" w:hanging="180"/>
+      </w:pPr>
+    </w:lvl>
+    <w:lvl w:ilvl="3" w:tplc="0419000F" w:tentative="1">
+      <w:start w:val="1"/>
+      <w:numFmt w:val="decimal"/>
+      <w:lvlText w:val="%4."/>
+      <w:lvlJc w:val="left"/>
+      <w:pPr>
+        <w:ind w:left="2880" w:hanging="360"/>
+      </w:pPr>
+    </w:lvl>
+    <w:lvl w:ilvl="4" w:tplc="04190019" w:tentative="1">
+      <w:start w:val="1"/>
+      <w:numFmt w:val="lowerLetter"/>
+      <w:lvlText w:val="%5."/>
+      <w:lvlJc w:val="left"/>
+      <w:pPr>
+        <w:ind w:left="3600" w:hanging="360"/>
+      </w:pPr>
+    </w:lvl>
+    <w:lvl w:ilvl="5" w:tplc="0419001B" w:tentative="1">
+      <w:start w:val="1"/>
+      <w:numFmt w:val="lowerRoman"/>
+      <w:lvlText w:val="%6."/>
+      <w:lvlJc w:val="right"/>
+      <w:pPr>
+        <w:ind w:left="4320" w:hanging="180"/>
+      </w:pPr>
+    </w:lvl>
+    <w:lvl w:ilvl="6" w:tplc="0419000F" w:tentative="1">
+      <w:start w:val="1"/>
+      <w:numFmt w:val="decimal"/>
+      <w:lvlText w:val="%7."/>
+      <w:lvlJc w:val="left"/>
+      <w:pPr>
+        <w:ind w:left="5040" w:hanging="360"/>
+      </w:pPr>
+    </w:lvl>
+    <w:lvl w:ilvl="7" w:tplc="04190019" w:tentative="1">
+      <w:start w:val="1"/>
+      <w:numFmt w:val="lowerLetter"/>
+      <w:lvlText w:val="%8."/>
+      <w:lvlJc w:val="left"/>
+      <w:pPr>
+        <w:ind w:left="5760" w:hanging="360"/>
+      </w:pPr>
+    </w:lvl>
+    <w:lvl w:ilvl="8" w:tplc="0419001B" w:tentative="1">
+      <w:start w:val="1"/>
+      <w:numFmt w:val="lowerRoman"/>
+      <w:lvlText w:val="%9."/>
+      <w:lvlJc w:val="right"/>
+      <w:pPr>
+        <w:ind w:left="6480" w:hanging="180"/>
+      </w:pPr>
+    </w:lvl>
+  </w:abstractNum>
+  <w:abstractNum w:abstractNumId="37" w15:restartNumberingAfterBreak="0">
     <w:nsid w:val="68C0494A"/>
     <w:multiLevelType w:val="hybridMultilevel"/>
     <w:tmpl w:val="D680A568"/>
@@ -6222,7 +9584,7 @@
       </w:rPr>
     </w:lvl>
   </w:abstractNum>
-  <w:abstractNum w:abstractNumId="29" w15:restartNumberingAfterBreak="0">
+  <w:abstractNum w:abstractNumId="38" w15:restartNumberingAfterBreak="0">
     <w:nsid w:val="702C2111"/>
     <w:multiLevelType w:val="hybridMultilevel"/>
     <w:tmpl w:val="81D412F2"/>
@@ -6362,7 +9724,7 @@
       </w:rPr>
     </w:lvl>
   </w:abstractNum>
-  <w:abstractNum w:abstractNumId="30" w15:restartNumberingAfterBreak="0">
+  <w:abstractNum w:abstractNumId="39" w15:restartNumberingAfterBreak="0">
     <w:nsid w:val="73B7048B"/>
     <w:multiLevelType w:val="hybridMultilevel"/>
     <w:tmpl w:val="DCE835CC"/>
@@ -6502,7 +9864,7 @@
       </w:rPr>
     </w:lvl>
   </w:abstractNum>
-  <w:abstractNum w:abstractNumId="31" w15:restartNumberingAfterBreak="0">
+  <w:abstractNum w:abstractNumId="40" w15:restartNumberingAfterBreak="0">
     <w:nsid w:val="74105628"/>
     <w:multiLevelType w:val="hybridMultilevel"/>
     <w:tmpl w:val="2E8E6682"/>
@@ -6642,7 +10004,7 @@
       </w:rPr>
     </w:lvl>
   </w:abstractNum>
-  <w:abstractNum w:abstractNumId="32" w15:restartNumberingAfterBreak="0">
+  <w:abstractNum w:abstractNumId="41" w15:restartNumberingAfterBreak="0">
     <w:nsid w:val="77A305C8"/>
     <w:multiLevelType w:val="hybridMultilevel"/>
     <w:tmpl w:val="F1D4D16E"/>
@@ -6782,7 +10144,7 @@
       </w:rPr>
     </w:lvl>
   </w:abstractNum>
-  <w:abstractNum w:abstractNumId="33" w15:restartNumberingAfterBreak="0">
+  <w:abstractNum w:abstractNumId="42" w15:restartNumberingAfterBreak="0">
     <w:nsid w:val="7EF66D25"/>
     <w:multiLevelType w:val="hybridMultilevel"/>
     <w:tmpl w:val="E2100E6A"/>
@@ -6899,103 +10261,130 @@
     <w:abstractNumId w:val="0"/>
   </w:num>
   <w:num w:numId="2">
+    <w:abstractNumId w:val="14"/>
+  </w:num>
+  <w:num w:numId="3">
+    <w:abstractNumId w:val="31"/>
+  </w:num>
+  <w:num w:numId="4">
+    <w:abstractNumId w:val="30"/>
+  </w:num>
+  <w:num w:numId="5">
     <w:abstractNumId w:val="12"/>
   </w:num>
-  <w:num w:numId="3">
-    <w:abstractNumId w:val="23"/>
-  </w:num>
-  <w:num w:numId="4">
-    <w:abstractNumId w:val="22"/>
-  </w:num>
-  <w:num w:numId="5">
-    <w:abstractNumId w:val="10"/>
-  </w:num>
   <w:num w:numId="6">
-    <w:abstractNumId w:val="7"/>
+    <w:abstractNumId w:val="8"/>
   </w:num>
   <w:num w:numId="7">
-    <w:abstractNumId w:val="9"/>
+    <w:abstractNumId w:val="11"/>
   </w:num>
   <w:num w:numId="8">
     <w:abstractNumId w:val="1"/>
   </w:num>
   <w:num w:numId="9">
-    <w:abstractNumId w:val="4"/>
+    <w:abstractNumId w:val="5"/>
   </w:num>
   <w:num w:numId="10">
-    <w:abstractNumId w:val="8"/>
+    <w:abstractNumId w:val="10"/>
   </w:num>
   <w:num w:numId="11">
-    <w:abstractNumId w:val="15"/>
+    <w:abstractNumId w:val="19"/>
   </w:num>
   <w:num w:numId="12">
-    <w:abstractNumId w:val="17"/>
+    <w:abstractNumId w:val="23"/>
   </w:num>
   <w:num w:numId="13">
-    <w:abstractNumId w:val="13"/>
+    <w:abstractNumId w:val="16"/>
   </w:num>
   <w:num w:numId="14">
-    <w:abstractNumId w:val="5"/>
+    <w:abstractNumId w:val="6"/>
   </w:num>
   <w:num w:numId="15">
-    <w:abstractNumId w:val="33"/>
+    <w:abstractNumId w:val="42"/>
   </w:num>
   <w:num w:numId="16">
-    <w:abstractNumId w:val="19"/>
+    <w:abstractNumId w:val="25"/>
   </w:num>
   <w:num w:numId="17">
-    <w:abstractNumId w:val="16"/>
+    <w:abstractNumId w:val="20"/>
   </w:num>
   <w:num w:numId="18">
-    <w:abstractNumId w:val="20"/>
+    <w:abstractNumId w:val="27"/>
   </w:num>
   <w:num w:numId="19">
-    <w:abstractNumId w:val="6"/>
+    <w:abstractNumId w:val="7"/>
   </w:num>
   <w:num w:numId="20">
-    <w:abstractNumId w:val="30"/>
+    <w:abstractNumId w:val="39"/>
   </w:num>
   <w:num w:numId="21">
-    <w:abstractNumId w:val="21"/>
+    <w:abstractNumId w:val="29"/>
   </w:num>
   <w:num w:numId="22">
-    <w:abstractNumId w:val="28"/>
+    <w:abstractNumId w:val="37"/>
   </w:num>
   <w:num w:numId="23">
-    <w:abstractNumId w:val="11"/>
+    <w:abstractNumId w:val="13"/>
   </w:num>
   <w:num w:numId="24">
     <w:abstractNumId w:val="3"/>
   </w:num>
   <w:num w:numId="25">
-    <w:abstractNumId w:val="26"/>
+    <w:abstractNumId w:val="34"/>
   </w:num>
   <w:num w:numId="26">
-    <w:abstractNumId w:val="29"/>
+    <w:abstractNumId w:val="38"/>
   </w:num>
   <w:num w:numId="27">
     <w:abstractNumId w:val="2"/>
   </w:num>
   <w:num w:numId="28">
-    <w:abstractNumId w:val="27"/>
+    <w:abstractNumId w:val="35"/>
   </w:num>
   <w:num w:numId="29">
-    <w:abstractNumId w:val="14"/>
+    <w:abstractNumId w:val="18"/>
   </w:num>
   <w:num w:numId="30">
+    <w:abstractNumId w:val="32"/>
+  </w:num>
+  <w:num w:numId="31">
+    <w:abstractNumId w:val="40"/>
+  </w:num>
+  <w:num w:numId="32">
+    <w:abstractNumId w:val="41"/>
+  </w:num>
+  <w:num w:numId="33">
+    <w:abstractNumId w:val="33"/>
+  </w:num>
+  <w:num w:numId="34">
     <w:abstractNumId w:val="24"/>
   </w:num>
-  <w:num w:numId="31">
-    <w:abstractNumId w:val="31"/>
+  <w:num w:numId="35">
+    <w:abstractNumId w:val="22"/>
   </w:num>
-  <w:num w:numId="32">
-    <w:abstractNumId w:val="32"/>
+  <w:num w:numId="36">
+    <w:abstractNumId w:val="21"/>
   </w:num>
-  <w:num w:numId="33">
-    <w:abstractNumId w:val="25"/>
+  <w:num w:numId="37">
+    <w:abstractNumId w:val="28"/>
   </w:num>
-  <w:num w:numId="34">
-    <w:abstractNumId w:val="18"/>
+  <w:num w:numId="38">
+    <w:abstractNumId w:val="26"/>
+  </w:num>
+  <w:num w:numId="39">
+    <w:abstractNumId w:val="15"/>
+  </w:num>
+  <w:num w:numId="40">
+    <w:abstractNumId w:val="17"/>
+  </w:num>
+  <w:num w:numId="41">
+    <w:abstractNumId w:val="4"/>
+  </w:num>
+  <w:num w:numId="42">
+    <w:abstractNumId w:val="9"/>
+  </w:num>
+  <w:num w:numId="43">
+    <w:abstractNumId w:val="36"/>
   </w:num>
 </w:numbering>
 </file>
@@ -8344,7 +11733,7 @@
 </file>
 
 <file path=customXml/itemProps1.xml><?xml version="1.0" encoding="utf-8"?>
-<ds:datastoreItem xmlns:ds="http://schemas.openxmlformats.org/officeDocument/2006/customXml" ds:itemID="{379AFAC6-CCB3-4F20-8100-F92769C88D5A}">
+<ds:datastoreItem xmlns:ds="http://schemas.openxmlformats.org/officeDocument/2006/customXml" ds:itemID="{DB155439-BEEB-4EC5-ADDD-D0FA57D1D88F}">
   <ds:schemaRefs>
     <ds:schemaRef ds:uri="http://schemas.openxmlformats.org/officeDocument/2006/bibliography"/>
   </ds:schemaRefs>

</xml_diff>